<commit_message>
Final verson of Report
</commit_message>
<xml_diff>
--- a/Final Report Group 5/Final report Group 5.docx
+++ b/Final Report Group 5/Final report Group 5.docx
@@ -634,7 +634,7 @@
           <w:rFonts w:cs="Times New Roman"/>
         </w:rPr>
       </w:pPr>
-      <w:bookmarkStart w:id="0" w:name="_Toc234018750"/>
+      <w:bookmarkStart w:id="0" w:name="_Toc234054635"/>
       <w:r>
         <w:rPr>
           <w:rFonts w:cs="Times New Roman"/>
@@ -905,7 +905,7 @@
           <w:rFonts w:cs="Times New Roman"/>
         </w:rPr>
       </w:pPr>
-      <w:bookmarkStart w:id="1" w:name="_Toc234018751"/>
+      <w:bookmarkStart w:id="1" w:name="_Toc234054636"/>
       <w:r>
         <w:rPr>
           <w:rFonts w:cs="Times New Roman"/>
@@ -978,7 +978,13 @@
     <w:sdt>
       <w:sdtPr>
         <w:rPr>
+          <w:rFonts w:eastAsiaTheme="minorHAnsi" w:cstheme="minorBidi"/>
+          <w:color w:val="auto"/>
+          <w:kern w:val="2"/>
+          <w:sz w:val="24"/>
+          <w:szCs w:val="24"/>
           <w:lang w:val="fr-FR"/>
+          <w14:ligatures w14:val="standardContextual"/>
         </w:rPr>
         <w:id w:val="1593056295"/>
         <w:docPartObj>
@@ -988,14 +994,8 @@
       </w:sdtPr>
       <w:sdtEndPr>
         <w:rPr>
-          <w:rFonts w:eastAsiaTheme="minorHAnsi" w:cstheme="minorBidi"/>
           <w:b/>
           <w:bCs/>
-          <w:color w:val="auto"/>
-          <w:kern w:val="2"/>
-          <w:sz w:val="24"/>
-          <w:szCs w:val="24"/>
-          <w14:ligatures w14:val="standardContextual"/>
         </w:rPr>
       </w:sdtEndPr>
       <w:sdtContent>
@@ -1045,7 +1045,7 @@
             </w:rPr>
             <w:fldChar w:fldCharType="separate"/>
           </w:r>
-          <w:hyperlink w:anchor="_Toc234018750" w:history="1">
+          <w:hyperlink w:anchor="_Toc234054635" w:history="1">
             <w:r>
               <w:rPr>
                 <w:rStyle w:val="Lienhypertexte"/>
@@ -1072,7 +1072,7 @@
                 <w:noProof/>
                 <w:webHidden/>
               </w:rPr>
-              <w:instrText xml:space="preserve"> PAGEREF _Toc234018750 \h </w:instrText>
+              <w:instrText xml:space="preserve"> PAGEREF _Toc234054635 \h </w:instrText>
             </w:r>
             <w:r>
               <w:rPr>
@@ -1114,7 +1114,7 @@
               <w:noProof/>
             </w:rPr>
           </w:pPr>
-          <w:hyperlink w:anchor="_Toc234018751" w:history="1">
+          <w:hyperlink w:anchor="_Toc234054636" w:history="1">
             <w:r>
               <w:rPr>
                 <w:rStyle w:val="Lienhypertexte"/>
@@ -1141,7 +1141,7 @@
                 <w:noProof/>
                 <w:webHidden/>
               </w:rPr>
-              <w:instrText xml:space="preserve"> PAGEREF _Toc234018751 \h </w:instrText>
+              <w:instrText xml:space="preserve"> PAGEREF _Toc234054636 \h </w:instrText>
             </w:r>
             <w:r>
               <w:rPr>
@@ -1183,7 +1183,7 @@
               <w:noProof/>
             </w:rPr>
           </w:pPr>
-          <w:hyperlink w:anchor="_Toc234018752" w:history="1">
+          <w:hyperlink w:anchor="_Toc234054637" w:history="1">
             <w:r>
               <w:rPr>
                 <w:rStyle w:val="Lienhypertexte"/>
@@ -1210,7 +1210,7 @@
                 <w:noProof/>
                 <w:webHidden/>
               </w:rPr>
-              <w:instrText xml:space="preserve"> PAGEREF _Toc234018752 \h </w:instrText>
+              <w:instrText xml:space="preserve"> PAGEREF _Toc234054637 \h </w:instrText>
             </w:r>
             <w:r>
               <w:rPr>
@@ -1252,7 +1252,7 @@
               <w:noProof/>
             </w:rPr>
           </w:pPr>
-          <w:hyperlink w:anchor="_Toc234018753" w:history="1">
+          <w:hyperlink w:anchor="_Toc234054638" w:history="1">
             <w:r>
               <w:rPr>
                 <w:rStyle w:val="Lienhypertexte"/>
@@ -1279,7 +1279,7 @@
                 <w:noProof/>
                 <w:webHidden/>
               </w:rPr>
-              <w:instrText xml:space="preserve"> PAGEREF _Toc234018753 \h </w:instrText>
+              <w:instrText xml:space="preserve"> PAGEREF _Toc234054638 \h </w:instrText>
             </w:r>
             <w:r>
               <w:rPr>
@@ -1321,7 +1321,7 @@
               <w:noProof/>
             </w:rPr>
           </w:pPr>
-          <w:hyperlink w:anchor="_Toc234018754" w:history="1">
+          <w:hyperlink w:anchor="_Toc234054639" w:history="1">
             <w:r>
               <w:rPr>
                 <w:rStyle w:val="Lienhypertexte"/>
@@ -1348,7 +1348,7 @@
                 <w:noProof/>
                 <w:webHidden/>
               </w:rPr>
-              <w:instrText xml:space="preserve"> PAGEREF _Toc234018754 \h </w:instrText>
+              <w:instrText xml:space="preserve"> PAGEREF _Toc234054639 \h </w:instrText>
             </w:r>
             <w:r>
               <w:rPr>
@@ -1390,7 +1390,7 @@
               <w:noProof/>
             </w:rPr>
           </w:pPr>
-          <w:hyperlink w:anchor="_Toc234018755" w:history="1">
+          <w:hyperlink w:anchor="_Toc234054640" w:history="1">
             <w:r>
               <w:rPr>
                 <w:rStyle w:val="Lienhypertexte"/>
@@ -1417,7 +1417,7 @@
                 <w:noProof/>
                 <w:webHidden/>
               </w:rPr>
-              <w:instrText xml:space="preserve"> PAGEREF _Toc234018755 \h </w:instrText>
+              <w:instrText xml:space="preserve"> PAGEREF _Toc234054640 \h </w:instrText>
             </w:r>
             <w:r>
               <w:rPr>
@@ -1459,7 +1459,7 @@
               <w:noProof/>
             </w:rPr>
           </w:pPr>
-          <w:hyperlink w:anchor="_Toc234018756" w:history="1">
+          <w:hyperlink w:anchor="_Toc234054641" w:history="1">
             <w:r>
               <w:rPr>
                 <w:rStyle w:val="Lienhypertexte"/>
@@ -1486,7 +1486,7 @@
                 <w:noProof/>
                 <w:webHidden/>
               </w:rPr>
-              <w:instrText xml:space="preserve"> PAGEREF _Toc234018756 \h </w:instrText>
+              <w:instrText xml:space="preserve"> PAGEREF _Toc234054641 \h </w:instrText>
             </w:r>
             <w:r>
               <w:rPr>
@@ -1528,7 +1528,7 @@
               <w:noProof/>
             </w:rPr>
           </w:pPr>
-          <w:hyperlink w:anchor="_Toc234018757" w:history="1">
+          <w:hyperlink w:anchor="_Toc234054642" w:history="1">
             <w:r>
               <w:rPr>
                 <w:rStyle w:val="Lienhypertexte"/>
@@ -1555,7 +1555,7 @@
                 <w:noProof/>
                 <w:webHidden/>
               </w:rPr>
-              <w:instrText xml:space="preserve"> PAGEREF _Toc234018757 \h </w:instrText>
+              <w:instrText xml:space="preserve"> PAGEREF _Toc234054642 \h </w:instrText>
             </w:r>
             <w:r>
               <w:rPr>
@@ -1597,7 +1597,7 @@
               <w:noProof/>
             </w:rPr>
           </w:pPr>
-          <w:hyperlink w:anchor="_Toc234018758" w:history="1">
+          <w:hyperlink w:anchor="_Toc234054643" w:history="1">
             <w:r>
               <w:rPr>
                 <w:rStyle w:val="Lienhypertexte"/>
@@ -1624,7 +1624,7 @@
                 <w:noProof/>
                 <w:webHidden/>
               </w:rPr>
-              <w:instrText xml:space="preserve"> PAGEREF _Toc234018758 \h </w:instrText>
+              <w:instrText xml:space="preserve"> PAGEREF _Toc234054643 \h </w:instrText>
             </w:r>
             <w:r>
               <w:rPr>
@@ -1666,7 +1666,7 @@
               <w:noProof/>
             </w:rPr>
           </w:pPr>
-          <w:hyperlink w:anchor="_Toc234018759" w:history="1">
+          <w:hyperlink w:anchor="_Toc234054644" w:history="1">
             <w:r>
               <w:rPr>
                 <w:rStyle w:val="Lienhypertexte"/>
@@ -1693,7 +1693,7 @@
                 <w:noProof/>
                 <w:webHidden/>
               </w:rPr>
-              <w:instrText xml:space="preserve"> PAGEREF _Toc234018759 \h </w:instrText>
+              <w:instrText xml:space="preserve"> PAGEREF _Toc234054644 \h </w:instrText>
             </w:r>
             <w:r>
               <w:rPr>
@@ -1735,7 +1735,7 @@
               <w:noProof/>
             </w:rPr>
           </w:pPr>
-          <w:hyperlink w:anchor="_Toc234018760" w:history="1">
+          <w:hyperlink w:anchor="_Toc234054645" w:history="1">
             <w:r>
               <w:rPr>
                 <w:rStyle w:val="Lienhypertexte"/>
@@ -1762,7 +1762,7 @@
                 <w:noProof/>
                 <w:webHidden/>
               </w:rPr>
-              <w:instrText xml:space="preserve"> PAGEREF _Toc234018760 \h </w:instrText>
+              <w:instrText xml:space="preserve"> PAGEREF _Toc234054645 \h </w:instrText>
             </w:r>
             <w:r>
               <w:rPr>
@@ -1804,7 +1804,7 @@
               <w:noProof/>
             </w:rPr>
           </w:pPr>
-          <w:hyperlink w:anchor="_Toc234018761" w:history="1">
+          <w:hyperlink w:anchor="_Toc234054646" w:history="1">
             <w:r>
               <w:rPr>
                 <w:rStyle w:val="Lienhypertexte"/>
@@ -1831,7 +1831,7 @@
                 <w:noProof/>
                 <w:webHidden/>
               </w:rPr>
-              <w:instrText xml:space="preserve"> PAGEREF _Toc234018761 \h </w:instrText>
+              <w:instrText xml:space="preserve"> PAGEREF _Toc234054646 \h </w:instrText>
             </w:r>
             <w:r>
               <w:rPr>
@@ -1873,7 +1873,7 @@
               <w:noProof/>
             </w:rPr>
           </w:pPr>
-          <w:hyperlink w:anchor="_Toc234018762" w:history="1">
+          <w:hyperlink w:anchor="_Toc234054647" w:history="1">
             <w:r>
               <w:rPr>
                 <w:rStyle w:val="Lienhypertexte"/>
@@ -1900,7 +1900,7 @@
                 <w:noProof/>
                 <w:webHidden/>
               </w:rPr>
-              <w:instrText xml:space="preserve"> PAGEREF _Toc234018762 \h </w:instrText>
+              <w:instrText xml:space="preserve"> PAGEREF _Toc234054647 \h </w:instrText>
             </w:r>
             <w:r>
               <w:rPr>
@@ -1942,7 +1942,7 @@
               <w:noProof/>
             </w:rPr>
           </w:pPr>
-          <w:hyperlink w:anchor="_Toc234018763" w:history="1">
+          <w:hyperlink w:anchor="_Toc234054648" w:history="1">
             <w:r>
               <w:rPr>
                 <w:rStyle w:val="Lienhypertexte"/>
@@ -1969,7 +1969,7 @@
                 <w:noProof/>
                 <w:webHidden/>
               </w:rPr>
-              <w:instrText xml:space="preserve"> PAGEREF _Toc234018763 \h </w:instrText>
+              <w:instrText xml:space="preserve"> PAGEREF _Toc234054648 \h </w:instrText>
             </w:r>
             <w:r>
               <w:rPr>
@@ -2011,7 +2011,7 @@
               <w:noProof/>
             </w:rPr>
           </w:pPr>
-          <w:hyperlink w:anchor="_Toc234018764" w:history="1">
+          <w:hyperlink w:anchor="_Toc234054649" w:history="1">
             <w:r>
               <w:rPr>
                 <w:rStyle w:val="Lienhypertexte"/>
@@ -2038,7 +2038,7 @@
                 <w:noProof/>
                 <w:webHidden/>
               </w:rPr>
-              <w:instrText xml:space="preserve"> PAGEREF _Toc234018764 \h </w:instrText>
+              <w:instrText xml:space="preserve"> PAGEREF _Toc234054649 \h </w:instrText>
             </w:r>
             <w:r>
               <w:rPr>
@@ -2080,7 +2080,7 @@
               <w:noProof/>
             </w:rPr>
           </w:pPr>
-          <w:hyperlink w:anchor="_Toc234018765" w:history="1">
+          <w:hyperlink w:anchor="_Toc234054650" w:history="1">
             <w:r>
               <w:rPr>
                 <w:rStyle w:val="Lienhypertexte"/>
@@ -2107,7 +2107,7 @@
                 <w:noProof/>
                 <w:webHidden/>
               </w:rPr>
-              <w:instrText xml:space="preserve"> PAGEREF _Toc234018765 \h </w:instrText>
+              <w:instrText xml:space="preserve"> PAGEREF _Toc234054650 \h </w:instrText>
             </w:r>
             <w:r>
               <w:rPr>
@@ -2149,7 +2149,7 @@
               <w:noProof/>
             </w:rPr>
           </w:pPr>
-          <w:hyperlink w:anchor="_Toc234018766" w:history="1">
+          <w:hyperlink w:anchor="_Toc234054651" w:history="1">
             <w:r>
               <w:rPr>
                 <w:rStyle w:val="Lienhypertexte"/>
@@ -2176,7 +2176,7 @@
                 <w:noProof/>
                 <w:webHidden/>
               </w:rPr>
-              <w:instrText xml:space="preserve"> PAGEREF _Toc234018766 \h </w:instrText>
+              <w:instrText xml:space="preserve"> PAGEREF _Toc234054651 \h </w:instrText>
             </w:r>
             <w:r>
               <w:rPr>
@@ -2218,7 +2218,7 @@
               <w:noProof/>
             </w:rPr>
           </w:pPr>
-          <w:hyperlink w:anchor="_Toc234018767" w:history="1">
+          <w:hyperlink w:anchor="_Toc234054652" w:history="1">
             <w:r>
               <w:rPr>
                 <w:rStyle w:val="Lienhypertexte"/>
@@ -2245,7 +2245,7 @@
                 <w:noProof/>
                 <w:webHidden/>
               </w:rPr>
-              <w:instrText xml:space="preserve"> PAGEREF _Toc234018767 \h </w:instrText>
+              <w:instrText xml:space="preserve"> PAGEREF _Toc234054652 \h </w:instrText>
             </w:r>
             <w:r>
               <w:rPr>
@@ -2287,7 +2287,7 @@
               <w:noProof/>
             </w:rPr>
           </w:pPr>
-          <w:hyperlink w:anchor="_Toc234018768" w:history="1">
+          <w:hyperlink w:anchor="_Toc234054653" w:history="1">
             <w:r>
               <w:rPr>
                 <w:rStyle w:val="Lienhypertexte"/>
@@ -2314,7 +2314,7 @@
                 <w:noProof/>
                 <w:webHidden/>
               </w:rPr>
-              <w:instrText xml:space="preserve"> PAGEREF _Toc234018768 \h </w:instrText>
+              <w:instrText xml:space="preserve"> PAGEREF _Toc234054653 \h </w:instrText>
             </w:r>
             <w:r>
               <w:rPr>
@@ -2356,7 +2356,7 @@
               <w:noProof/>
             </w:rPr>
           </w:pPr>
-          <w:hyperlink w:anchor="_Toc234018769" w:history="1">
+          <w:hyperlink w:anchor="_Toc234054654" w:history="1">
             <w:r>
               <w:rPr>
                 <w:rStyle w:val="Lienhypertexte"/>
@@ -2383,7 +2383,7 @@
                 <w:noProof/>
                 <w:webHidden/>
               </w:rPr>
-              <w:instrText xml:space="preserve"> PAGEREF _Toc234018769 \h </w:instrText>
+              <w:instrText xml:space="preserve"> PAGEREF _Toc234054654 \h </w:instrText>
             </w:r>
             <w:r>
               <w:rPr>
@@ -2425,7 +2425,7 @@
               <w:noProof/>
             </w:rPr>
           </w:pPr>
-          <w:hyperlink w:anchor="_Toc234018770" w:history="1">
+          <w:hyperlink w:anchor="_Toc234054655" w:history="1">
             <w:r>
               <w:rPr>
                 <w:rStyle w:val="Lienhypertexte"/>
@@ -2452,7 +2452,7 @@
                 <w:noProof/>
                 <w:webHidden/>
               </w:rPr>
-              <w:instrText xml:space="preserve"> PAGEREF _Toc234018770 \h </w:instrText>
+              <w:instrText xml:space="preserve"> PAGEREF _Toc234054655 \h </w:instrText>
             </w:r>
             <w:r>
               <w:rPr>
@@ -2494,7 +2494,7 @@
               <w:noProof/>
             </w:rPr>
           </w:pPr>
-          <w:hyperlink w:anchor="_Toc234018771" w:history="1">
+          <w:hyperlink w:anchor="_Toc234054656" w:history="1">
             <w:r>
               <w:rPr>
                 <w:rStyle w:val="Lienhypertexte"/>
@@ -2521,7 +2521,7 @@
                 <w:noProof/>
                 <w:webHidden/>
               </w:rPr>
-              <w:instrText xml:space="preserve"> PAGEREF _Toc234018771 \h </w:instrText>
+              <w:instrText xml:space="preserve"> PAGEREF _Toc234054656 \h </w:instrText>
             </w:r>
             <w:r>
               <w:rPr>
@@ -2563,7 +2563,7 @@
               <w:noProof/>
             </w:rPr>
           </w:pPr>
-          <w:hyperlink w:anchor="_Toc234018772" w:history="1">
+          <w:hyperlink w:anchor="_Toc234054657" w:history="1">
             <w:r>
               <w:rPr>
                 <w:rStyle w:val="Lienhypertexte"/>
@@ -2590,7 +2590,7 @@
                 <w:noProof/>
                 <w:webHidden/>
               </w:rPr>
-              <w:instrText xml:space="preserve"> PAGEREF _Toc234018772 \h </w:instrText>
+              <w:instrText xml:space="preserve"> PAGEREF _Toc234054657 \h </w:instrText>
             </w:r>
             <w:r>
               <w:rPr>
@@ -2632,7 +2632,7 @@
               <w:noProof/>
             </w:rPr>
           </w:pPr>
-          <w:hyperlink w:anchor="_Toc234018773" w:history="1">
+          <w:hyperlink w:anchor="_Toc234054658" w:history="1">
             <w:r>
               <w:rPr>
                 <w:rStyle w:val="Lienhypertexte"/>
@@ -2659,7 +2659,7 @@
                 <w:noProof/>
                 <w:webHidden/>
               </w:rPr>
-              <w:instrText xml:space="preserve"> PAGEREF _Toc234018773 \h </w:instrText>
+              <w:instrText xml:space="preserve"> PAGEREF _Toc234054658 \h </w:instrText>
             </w:r>
             <w:r>
               <w:rPr>
@@ -2701,7 +2701,7 @@
               <w:noProof/>
             </w:rPr>
           </w:pPr>
-          <w:hyperlink w:anchor="_Toc234018774" w:history="1">
+          <w:hyperlink w:anchor="_Toc234054659" w:history="1">
             <w:r>
               <w:rPr>
                 <w:rStyle w:val="Lienhypertexte"/>
@@ -2728,7 +2728,7 @@
                 <w:noProof/>
                 <w:webHidden/>
               </w:rPr>
-              <w:instrText xml:space="preserve"> PAGEREF _Toc234018774 \h </w:instrText>
+              <w:instrText xml:space="preserve"> PAGEREF _Toc234054659 \h </w:instrText>
             </w:r>
             <w:r>
               <w:rPr>
@@ -2770,7 +2770,7 @@
               <w:noProof/>
             </w:rPr>
           </w:pPr>
-          <w:hyperlink w:anchor="_Toc234018775" w:history="1">
+          <w:hyperlink w:anchor="_Toc234054660" w:history="1">
             <w:r>
               <w:rPr>
                 <w:rStyle w:val="Lienhypertexte"/>
@@ -2797,7 +2797,7 @@
                 <w:noProof/>
                 <w:webHidden/>
               </w:rPr>
-              <w:instrText xml:space="preserve"> PAGEREF _Toc234018775 \h </w:instrText>
+              <w:instrText xml:space="preserve"> PAGEREF _Toc234054660 \h </w:instrText>
             </w:r>
             <w:r>
               <w:rPr>
@@ -2839,7 +2839,7 @@
               <w:noProof/>
             </w:rPr>
           </w:pPr>
-          <w:hyperlink w:anchor="_Toc234018776" w:history="1">
+          <w:hyperlink w:anchor="_Toc234054661" w:history="1">
             <w:r>
               <w:rPr>
                 <w:rStyle w:val="Lienhypertexte"/>
@@ -2866,7 +2866,7 @@
                 <w:noProof/>
                 <w:webHidden/>
               </w:rPr>
-              <w:instrText xml:space="preserve"> PAGEREF _Toc234018776 \h </w:instrText>
+              <w:instrText xml:space="preserve"> PAGEREF _Toc234054661 \h </w:instrText>
             </w:r>
             <w:r>
               <w:rPr>
@@ -2908,7 +2908,7 @@
               <w:noProof/>
             </w:rPr>
           </w:pPr>
-          <w:hyperlink w:anchor="_Toc234018777" w:history="1">
+          <w:hyperlink w:anchor="_Toc234054662" w:history="1">
             <w:r>
               <w:rPr>
                 <w:rStyle w:val="Lienhypertexte"/>
@@ -2935,7 +2935,7 @@
                 <w:noProof/>
                 <w:webHidden/>
               </w:rPr>
-              <w:instrText xml:space="preserve"> PAGEREF _Toc234018777 \h </w:instrText>
+              <w:instrText xml:space="preserve"> PAGEREF _Toc234054662 \h </w:instrText>
             </w:r>
             <w:r>
               <w:rPr>
@@ -2977,7 +2977,7 @@
               <w:noProof/>
             </w:rPr>
           </w:pPr>
-          <w:hyperlink w:anchor="_Toc234018778" w:history="1">
+          <w:hyperlink w:anchor="_Toc234054663" w:history="1">
             <w:r>
               <w:rPr>
                 <w:rStyle w:val="Lienhypertexte"/>
@@ -3006,7 +3006,7 @@
                 <w:noProof/>
                 <w:webHidden/>
               </w:rPr>
-              <w:instrText xml:space="preserve"> PAGEREF _Toc234018778 \h </w:instrText>
+              <w:instrText xml:space="preserve"> PAGEREF _Toc234054663 \h </w:instrText>
             </w:r>
             <w:r>
               <w:rPr>
@@ -3048,7 +3048,7 @@
               <w:noProof/>
             </w:rPr>
           </w:pPr>
-          <w:hyperlink w:anchor="_Toc234018779" w:history="1">
+          <w:hyperlink w:anchor="_Toc234054664" w:history="1">
             <w:r>
               <w:rPr>
                 <w:rStyle w:val="Lienhypertexte"/>
@@ -3075,7 +3075,7 @@
                 <w:noProof/>
                 <w:webHidden/>
               </w:rPr>
-              <w:instrText xml:space="preserve"> PAGEREF _Toc234018779 \h </w:instrText>
+              <w:instrText xml:space="preserve"> PAGEREF _Toc234054664 \h </w:instrText>
             </w:r>
             <w:r>
               <w:rPr>
@@ -3117,7 +3117,7 @@
               <w:noProof/>
             </w:rPr>
           </w:pPr>
-          <w:hyperlink w:anchor="_Toc234018780" w:history="1">
+          <w:hyperlink w:anchor="_Toc234054665" w:history="1">
             <w:r>
               <w:rPr>
                 <w:rStyle w:val="Lienhypertexte"/>
@@ -3144,7 +3144,7 @@
                 <w:noProof/>
                 <w:webHidden/>
               </w:rPr>
-              <w:instrText xml:space="preserve"> PAGEREF _Toc234018780 \h </w:instrText>
+              <w:instrText xml:space="preserve"> PAGEREF _Toc234054665 \h </w:instrText>
             </w:r>
             <w:r>
               <w:rPr>
@@ -3186,7 +3186,7 @@
               <w:noProof/>
             </w:rPr>
           </w:pPr>
-          <w:hyperlink w:anchor="_Toc234018781" w:history="1">
+          <w:hyperlink w:anchor="_Toc234054666" w:history="1">
             <w:r>
               <w:rPr>
                 <w:rStyle w:val="Lienhypertexte"/>
@@ -3213,7 +3213,7 @@
                 <w:noProof/>
                 <w:webHidden/>
               </w:rPr>
-              <w:instrText xml:space="preserve"> PAGEREF _Toc234018781 \h </w:instrText>
+              <w:instrText xml:space="preserve"> PAGEREF _Toc234054666 \h </w:instrText>
             </w:r>
             <w:r>
               <w:rPr>
@@ -3255,7 +3255,7 @@
               <w:noProof/>
             </w:rPr>
           </w:pPr>
-          <w:hyperlink w:anchor="_Toc234018782" w:history="1">
+          <w:hyperlink w:anchor="_Toc234054667" w:history="1">
             <w:r>
               <w:rPr>
                 <w:rStyle w:val="Lienhypertexte"/>
@@ -3282,7 +3282,7 @@
                 <w:noProof/>
                 <w:webHidden/>
               </w:rPr>
-              <w:instrText xml:space="preserve"> PAGEREF _Toc234018782 \h </w:instrText>
+              <w:instrText xml:space="preserve"> PAGEREF _Toc234054667 \h </w:instrText>
             </w:r>
             <w:r>
               <w:rPr>
@@ -3324,7 +3324,7 @@
               <w:noProof/>
             </w:rPr>
           </w:pPr>
-          <w:hyperlink w:anchor="_Toc234018783" w:history="1">
+          <w:hyperlink w:anchor="_Toc234054668" w:history="1">
             <w:r>
               <w:rPr>
                 <w:rStyle w:val="Lienhypertexte"/>
@@ -3351,7 +3351,7 @@
                 <w:noProof/>
                 <w:webHidden/>
               </w:rPr>
-              <w:instrText xml:space="preserve"> PAGEREF _Toc234018783 \h </w:instrText>
+              <w:instrText xml:space="preserve"> PAGEREF _Toc234054668 \h </w:instrText>
             </w:r>
             <w:r>
               <w:rPr>
@@ -3393,7 +3393,7 @@
               <w:noProof/>
             </w:rPr>
           </w:pPr>
-          <w:hyperlink w:anchor="_Toc234018784" w:history="1">
+          <w:hyperlink w:anchor="_Toc234054669" w:history="1">
             <w:r>
               <w:rPr>
                 <w:rStyle w:val="Lienhypertexte"/>
@@ -3420,7 +3420,7 @@
                 <w:noProof/>
                 <w:webHidden/>
               </w:rPr>
-              <w:instrText xml:space="preserve"> PAGEREF _Toc234018784 \h </w:instrText>
+              <w:instrText xml:space="preserve"> PAGEREF _Toc234054669 \h </w:instrText>
             </w:r>
             <w:r>
               <w:rPr>
@@ -3462,7 +3462,7 @@
               <w:noProof/>
             </w:rPr>
           </w:pPr>
-          <w:hyperlink w:anchor="_Toc234018785" w:history="1">
+          <w:hyperlink w:anchor="_Toc234054670" w:history="1">
             <w:r>
               <w:rPr>
                 <w:rStyle w:val="Lienhypertexte"/>
@@ -3489,7 +3489,7 @@
                 <w:noProof/>
                 <w:webHidden/>
               </w:rPr>
-              <w:instrText xml:space="preserve"> PAGEREF _Toc234018785 \h </w:instrText>
+              <w:instrText xml:space="preserve"> PAGEREF _Toc234054670 \h </w:instrText>
             </w:r>
             <w:r>
               <w:rPr>
@@ -3531,7 +3531,7 @@
               <w:noProof/>
             </w:rPr>
           </w:pPr>
-          <w:hyperlink w:anchor="_Toc234018786" w:history="1">
+          <w:hyperlink w:anchor="_Toc234054671" w:history="1">
             <w:r>
               <w:rPr>
                 <w:rStyle w:val="Lienhypertexte"/>
@@ -3558,7 +3558,7 @@
                 <w:noProof/>
                 <w:webHidden/>
               </w:rPr>
-              <w:instrText xml:space="preserve"> PAGEREF _Toc234018786 \h </w:instrText>
+              <w:instrText xml:space="preserve"> PAGEREF _Toc234054671 \h </w:instrText>
             </w:r>
             <w:r>
               <w:rPr>
@@ -3600,7 +3600,7 @@
               <w:noProof/>
             </w:rPr>
           </w:pPr>
-          <w:hyperlink w:anchor="_Toc234018787" w:history="1">
+          <w:hyperlink w:anchor="_Toc234054672" w:history="1">
             <w:r>
               <w:rPr>
                 <w:rStyle w:val="Lienhypertexte"/>
@@ -3627,7 +3627,7 @@
                 <w:noProof/>
                 <w:webHidden/>
               </w:rPr>
-              <w:instrText xml:space="preserve"> PAGEREF _Toc234018787 \h </w:instrText>
+              <w:instrText xml:space="preserve"> PAGEREF _Toc234054672 \h </w:instrText>
             </w:r>
             <w:r>
               <w:rPr>
@@ -3669,7 +3669,7 @@
               <w:noProof/>
             </w:rPr>
           </w:pPr>
-          <w:hyperlink w:anchor="_Toc234018788" w:history="1">
+          <w:hyperlink w:anchor="_Toc234054673" w:history="1">
             <w:r>
               <w:rPr>
                 <w:rStyle w:val="Lienhypertexte"/>
@@ -3696,7 +3696,7 @@
                 <w:noProof/>
                 <w:webHidden/>
               </w:rPr>
-              <w:instrText xml:space="preserve"> PAGEREF _Toc234018788 \h </w:instrText>
+              <w:instrText xml:space="preserve"> PAGEREF _Toc234054673 \h </w:instrText>
             </w:r>
             <w:r>
               <w:rPr>
@@ -3738,7 +3738,7 @@
               <w:noProof/>
             </w:rPr>
           </w:pPr>
-          <w:hyperlink w:anchor="_Toc234018789" w:history="1">
+          <w:hyperlink w:anchor="_Toc234054674" w:history="1">
             <w:r>
               <w:rPr>
                 <w:rStyle w:val="Lienhypertexte"/>
@@ -3765,7 +3765,7 @@
                 <w:noProof/>
                 <w:webHidden/>
               </w:rPr>
-              <w:instrText xml:space="preserve"> PAGEREF _Toc234018789 \h </w:instrText>
+              <w:instrText xml:space="preserve"> PAGEREF _Toc234054674 \h </w:instrText>
             </w:r>
             <w:r>
               <w:rPr>
@@ -3807,7 +3807,7 @@
               <w:noProof/>
             </w:rPr>
           </w:pPr>
-          <w:hyperlink w:anchor="_Toc234018790" w:history="1">
+          <w:hyperlink w:anchor="_Toc234054675" w:history="1">
             <w:r>
               <w:rPr>
                 <w:rStyle w:val="Lienhypertexte"/>
@@ -3834,7 +3834,7 @@
                 <w:noProof/>
                 <w:webHidden/>
               </w:rPr>
-              <w:instrText xml:space="preserve"> PAGEREF _Toc234018790 \h </w:instrText>
+              <w:instrText xml:space="preserve"> PAGEREF _Toc234054675 \h </w:instrText>
             </w:r>
             <w:r>
               <w:rPr>
@@ -3876,7 +3876,7 @@
               <w:noProof/>
             </w:rPr>
           </w:pPr>
-          <w:hyperlink w:anchor="_Toc234018791" w:history="1">
+          <w:hyperlink w:anchor="_Toc234054676" w:history="1">
             <w:r>
               <w:rPr>
                 <w:rStyle w:val="Lienhypertexte"/>
@@ -3903,7 +3903,7 @@
                 <w:noProof/>
                 <w:webHidden/>
               </w:rPr>
-              <w:instrText xml:space="preserve"> PAGEREF _Toc234018791 \h </w:instrText>
+              <w:instrText xml:space="preserve"> PAGEREF _Toc234054676 \h </w:instrText>
             </w:r>
             <w:r>
               <w:rPr>
@@ -3945,7 +3945,7 @@
               <w:noProof/>
             </w:rPr>
           </w:pPr>
-          <w:hyperlink w:anchor="_Toc234018792" w:history="1">
+          <w:hyperlink w:anchor="_Toc234054677" w:history="1">
             <w:r>
               <w:rPr>
                 <w:rStyle w:val="Lienhypertexte"/>
@@ -3972,7 +3972,7 @@
                 <w:noProof/>
                 <w:webHidden/>
               </w:rPr>
-              <w:instrText xml:space="preserve"> PAGEREF _Toc234018792 \h </w:instrText>
+              <w:instrText xml:space="preserve"> PAGEREF _Toc234054677 \h </w:instrText>
             </w:r>
             <w:r>
               <w:rPr>
@@ -4014,7 +4014,7 @@
               <w:noProof/>
             </w:rPr>
           </w:pPr>
-          <w:hyperlink w:anchor="_Toc234018793" w:history="1">
+          <w:hyperlink w:anchor="_Toc234054678" w:history="1">
             <w:r>
               <w:rPr>
                 <w:rStyle w:val="Lienhypertexte"/>
@@ -4041,7 +4041,7 @@
                 <w:noProof/>
                 <w:webHidden/>
               </w:rPr>
-              <w:instrText xml:space="preserve"> PAGEREF _Toc234018793 \h </w:instrText>
+              <w:instrText xml:space="preserve"> PAGEREF _Toc234054678 \h </w:instrText>
             </w:r>
             <w:r>
               <w:rPr>
@@ -4083,7 +4083,7 @@
               <w:noProof/>
             </w:rPr>
           </w:pPr>
-          <w:hyperlink w:anchor="_Toc234018794" w:history="1">
+          <w:hyperlink w:anchor="_Toc234054679" w:history="1">
             <w:r>
               <w:rPr>
                 <w:rStyle w:val="Lienhypertexte"/>
@@ -4110,7 +4110,7 @@
                 <w:noProof/>
                 <w:webHidden/>
               </w:rPr>
-              <w:instrText xml:space="preserve"> PAGEREF _Toc234018794 \h </w:instrText>
+              <w:instrText xml:space="preserve"> PAGEREF _Toc234054679 \h </w:instrText>
             </w:r>
             <w:r>
               <w:rPr>
@@ -4152,7 +4152,7 @@
               <w:noProof/>
             </w:rPr>
           </w:pPr>
-          <w:hyperlink w:anchor="_Toc234018795" w:history="1">
+          <w:hyperlink w:anchor="_Toc234054680" w:history="1">
             <w:r>
               <w:rPr>
                 <w:rStyle w:val="Lienhypertexte"/>
@@ -4179,7 +4179,7 @@
                 <w:noProof/>
                 <w:webHidden/>
               </w:rPr>
-              <w:instrText xml:space="preserve"> PAGEREF _Toc234018795 \h </w:instrText>
+              <w:instrText xml:space="preserve"> PAGEREF _Toc234054680 \h </w:instrText>
             </w:r>
             <w:r>
               <w:rPr>
@@ -4221,7 +4221,7 @@
               <w:noProof/>
             </w:rPr>
           </w:pPr>
-          <w:hyperlink w:anchor="_Toc234018796" w:history="1">
+          <w:hyperlink w:anchor="_Toc234054681" w:history="1">
             <w:r>
               <w:rPr>
                 <w:rStyle w:val="Lienhypertexte"/>
@@ -4248,7 +4248,7 @@
                 <w:noProof/>
                 <w:webHidden/>
               </w:rPr>
-              <w:instrText xml:space="preserve"> PAGEREF _Toc234018796 \h </w:instrText>
+              <w:instrText xml:space="preserve"> PAGEREF _Toc234054681 \h </w:instrText>
             </w:r>
             <w:r>
               <w:rPr>
@@ -4290,7 +4290,7 @@
               <w:noProof/>
             </w:rPr>
           </w:pPr>
-          <w:hyperlink w:anchor="_Toc234018797" w:history="1">
+          <w:hyperlink w:anchor="_Toc234054682" w:history="1">
             <w:r>
               <w:rPr>
                 <w:rStyle w:val="Lienhypertexte"/>
@@ -4317,7 +4317,7 @@
                 <w:noProof/>
                 <w:webHidden/>
               </w:rPr>
-              <w:instrText xml:space="preserve"> PAGEREF _Toc234018797 \h </w:instrText>
+              <w:instrText xml:space="preserve"> PAGEREF _Toc234054682 \h </w:instrText>
             </w:r>
             <w:r>
               <w:rPr>
@@ -4359,7 +4359,7 @@
               <w:noProof/>
             </w:rPr>
           </w:pPr>
-          <w:hyperlink w:anchor="_Toc234018798" w:history="1">
+          <w:hyperlink w:anchor="_Toc234054683" w:history="1">
             <w:r>
               <w:rPr>
                 <w:rStyle w:val="Lienhypertexte"/>
@@ -4386,7 +4386,7 @@
                 <w:noProof/>
                 <w:webHidden/>
               </w:rPr>
-              <w:instrText xml:space="preserve"> PAGEREF _Toc234018798 \h </w:instrText>
+              <w:instrText xml:space="preserve"> PAGEREF _Toc234054683 \h </w:instrText>
             </w:r>
             <w:r>
               <w:rPr>
@@ -4428,7 +4428,7 @@
               <w:noProof/>
             </w:rPr>
           </w:pPr>
-          <w:hyperlink w:anchor="_Toc234018799" w:history="1">
+          <w:hyperlink w:anchor="_Toc234054684" w:history="1">
             <w:r>
               <w:rPr>
                 <w:rStyle w:val="Lienhypertexte"/>
@@ -4455,7 +4455,7 @@
                 <w:noProof/>
                 <w:webHidden/>
               </w:rPr>
-              <w:instrText xml:space="preserve"> PAGEREF _Toc234018799 \h </w:instrText>
+              <w:instrText xml:space="preserve"> PAGEREF _Toc234054684 \h </w:instrText>
             </w:r>
             <w:r>
               <w:rPr>
@@ -4497,7 +4497,7 @@
               <w:noProof/>
             </w:rPr>
           </w:pPr>
-          <w:hyperlink w:anchor="_Toc234018800" w:history="1">
+          <w:hyperlink w:anchor="_Toc234054685" w:history="1">
             <w:r>
               <w:rPr>
                 <w:rStyle w:val="Lienhypertexte"/>
@@ -4524,7 +4524,7 @@
                 <w:noProof/>
                 <w:webHidden/>
               </w:rPr>
-              <w:instrText xml:space="preserve"> PAGEREF _Toc234018800 \h </w:instrText>
+              <w:instrText xml:space="preserve"> PAGEREF _Toc234054685 \h </w:instrText>
             </w:r>
             <w:r>
               <w:rPr>
@@ -4566,7 +4566,7 @@
               <w:noProof/>
             </w:rPr>
           </w:pPr>
-          <w:hyperlink w:anchor="_Toc234018801" w:history="1">
+          <w:hyperlink w:anchor="_Toc234054686" w:history="1">
             <w:r>
               <w:rPr>
                 <w:rStyle w:val="Lienhypertexte"/>
@@ -4593,7 +4593,7 @@
                 <w:noProof/>
                 <w:webHidden/>
               </w:rPr>
-              <w:instrText xml:space="preserve"> PAGEREF _Toc234018801 \h </w:instrText>
+              <w:instrText xml:space="preserve"> PAGEREF _Toc234054686 \h </w:instrText>
             </w:r>
             <w:r>
               <w:rPr>
@@ -4635,7 +4635,7 @@
               <w:noProof/>
             </w:rPr>
           </w:pPr>
-          <w:hyperlink w:anchor="_Toc234018802" w:history="1">
+          <w:hyperlink w:anchor="_Toc234054687" w:history="1">
             <w:r>
               <w:rPr>
                 <w:rStyle w:val="Lienhypertexte"/>
@@ -4662,7 +4662,7 @@
                 <w:noProof/>
                 <w:webHidden/>
               </w:rPr>
-              <w:instrText xml:space="preserve"> PAGEREF _Toc234018802 \h </w:instrText>
+              <w:instrText xml:space="preserve"> PAGEREF _Toc234054687 \h </w:instrText>
             </w:r>
             <w:r>
               <w:rPr>
@@ -4704,7 +4704,7 @@
               <w:noProof/>
             </w:rPr>
           </w:pPr>
-          <w:hyperlink w:anchor="_Toc234018803" w:history="1">
+          <w:hyperlink w:anchor="_Toc234054688" w:history="1">
             <w:r>
               <w:rPr>
                 <w:rStyle w:val="Lienhypertexte"/>
@@ -4731,7 +4731,7 @@
                 <w:noProof/>
                 <w:webHidden/>
               </w:rPr>
-              <w:instrText xml:space="preserve"> PAGEREF _Toc234018803 \h </w:instrText>
+              <w:instrText xml:space="preserve"> PAGEREF _Toc234054688 \h </w:instrText>
             </w:r>
             <w:r>
               <w:rPr>
@@ -4773,7 +4773,7 @@
               <w:noProof/>
             </w:rPr>
           </w:pPr>
-          <w:hyperlink w:anchor="_Toc234018804" w:history="1">
+          <w:hyperlink w:anchor="_Toc234054689" w:history="1">
             <w:r>
               <w:rPr>
                 <w:rStyle w:val="Lienhypertexte"/>
@@ -4800,7 +4800,7 @@
                 <w:noProof/>
                 <w:webHidden/>
               </w:rPr>
-              <w:instrText xml:space="preserve"> PAGEREF _Toc234018804 \h </w:instrText>
+              <w:instrText xml:space="preserve"> PAGEREF _Toc234054689 \h </w:instrText>
             </w:r>
             <w:r>
               <w:rPr>
@@ -4842,7 +4842,7 @@
               <w:noProof/>
             </w:rPr>
           </w:pPr>
-          <w:hyperlink w:anchor="_Toc234018805" w:history="1">
+          <w:hyperlink w:anchor="_Toc234054690" w:history="1">
             <w:r>
               <w:rPr>
                 <w:rStyle w:val="Lienhypertexte"/>
@@ -4869,7 +4869,7 @@
                 <w:noProof/>
                 <w:webHidden/>
               </w:rPr>
-              <w:instrText xml:space="preserve"> PAGEREF _Toc234018805 \h </w:instrText>
+              <w:instrText xml:space="preserve"> PAGEREF _Toc234054690 \h </w:instrText>
             </w:r>
             <w:r>
               <w:rPr>
@@ -4911,7 +4911,7 @@
               <w:noProof/>
             </w:rPr>
           </w:pPr>
-          <w:hyperlink w:anchor="_Toc234018806" w:history="1">
+          <w:hyperlink w:anchor="_Toc234054691" w:history="1">
             <w:r>
               <w:rPr>
                 <w:rStyle w:val="Lienhypertexte"/>
@@ -4938,7 +4938,7 @@
                 <w:noProof/>
                 <w:webHidden/>
               </w:rPr>
-              <w:instrText xml:space="preserve"> PAGEREF _Toc234018806 \h </w:instrText>
+              <w:instrText xml:space="preserve"> PAGEREF _Toc234054691 \h </w:instrText>
             </w:r>
             <w:r>
               <w:rPr>
@@ -4980,7 +4980,7 @@
               <w:noProof/>
             </w:rPr>
           </w:pPr>
-          <w:hyperlink w:anchor="_Toc234018807" w:history="1">
+          <w:hyperlink w:anchor="_Toc234054692" w:history="1">
             <w:r>
               <w:rPr>
                 <w:rStyle w:val="Lienhypertexte"/>
@@ -5007,7 +5007,7 @@
                 <w:noProof/>
                 <w:webHidden/>
               </w:rPr>
-              <w:instrText xml:space="preserve"> PAGEREF _Toc234018807 \h </w:instrText>
+              <w:instrText xml:space="preserve"> PAGEREF _Toc234054692 \h </w:instrText>
             </w:r>
             <w:r>
               <w:rPr>
@@ -5049,7 +5049,7 @@
               <w:noProof/>
             </w:rPr>
           </w:pPr>
-          <w:hyperlink w:anchor="_Toc234018808" w:history="1">
+          <w:hyperlink w:anchor="_Toc234054693" w:history="1">
             <w:r>
               <w:rPr>
                 <w:rStyle w:val="Lienhypertexte"/>
@@ -5076,7 +5076,7 @@
                 <w:noProof/>
                 <w:webHidden/>
               </w:rPr>
-              <w:instrText xml:space="preserve"> PAGEREF _Toc234018808 \h </w:instrText>
+              <w:instrText xml:space="preserve"> PAGEREF _Toc234054693 \h </w:instrText>
             </w:r>
             <w:r>
               <w:rPr>
@@ -5118,7 +5118,7 @@
               <w:noProof/>
             </w:rPr>
           </w:pPr>
-          <w:hyperlink w:anchor="_Toc234018809" w:history="1">
+          <w:hyperlink w:anchor="_Toc234054694" w:history="1">
             <w:r>
               <w:rPr>
                 <w:rStyle w:val="Lienhypertexte"/>
@@ -5145,7 +5145,7 @@
                 <w:noProof/>
                 <w:webHidden/>
               </w:rPr>
-              <w:instrText xml:space="preserve"> PAGEREF _Toc234018809 \h </w:instrText>
+              <w:instrText xml:space="preserve"> PAGEREF _Toc234054694 \h </w:instrText>
             </w:r>
             <w:r>
               <w:rPr>
@@ -5187,7 +5187,7 @@
               <w:noProof/>
             </w:rPr>
           </w:pPr>
-          <w:hyperlink w:anchor="_Toc234018810" w:history="1">
+          <w:hyperlink w:anchor="_Toc234054695" w:history="1">
             <w:r>
               <w:rPr>
                 <w:rStyle w:val="Lienhypertexte"/>
@@ -5214,7 +5214,7 @@
                 <w:noProof/>
                 <w:webHidden/>
               </w:rPr>
-              <w:instrText xml:space="preserve"> PAGEREF _Toc234018810 \h </w:instrText>
+              <w:instrText xml:space="preserve"> PAGEREF _Toc234054695 \h </w:instrText>
             </w:r>
             <w:r>
               <w:rPr>
@@ -5256,7 +5256,7 @@
               <w:noProof/>
             </w:rPr>
           </w:pPr>
-          <w:hyperlink w:anchor="_Toc234018811" w:history="1">
+          <w:hyperlink w:anchor="_Toc234054696" w:history="1">
             <w:r>
               <w:rPr>
                 <w:rStyle w:val="Lienhypertexte"/>
@@ -5283,7 +5283,7 @@
                 <w:noProof/>
                 <w:webHidden/>
               </w:rPr>
-              <w:instrText xml:space="preserve"> PAGEREF _Toc234018811 \h </w:instrText>
+              <w:instrText xml:space="preserve"> PAGEREF _Toc234054696 \h </w:instrText>
             </w:r>
             <w:r>
               <w:rPr>
@@ -5325,7 +5325,7 @@
               <w:noProof/>
             </w:rPr>
           </w:pPr>
-          <w:hyperlink w:anchor="_Toc234018812" w:history="1">
+          <w:hyperlink w:anchor="_Toc234054697" w:history="1">
             <w:r>
               <w:rPr>
                 <w:rStyle w:val="Lienhypertexte"/>
@@ -5352,7 +5352,7 @@
                 <w:noProof/>
                 <w:webHidden/>
               </w:rPr>
-              <w:instrText xml:space="preserve"> PAGEREF _Toc234018812 \h </w:instrText>
+              <w:instrText xml:space="preserve"> PAGEREF _Toc234054697 \h </w:instrText>
             </w:r>
             <w:r>
               <w:rPr>
@@ -5394,7 +5394,7 @@
               <w:noProof/>
             </w:rPr>
           </w:pPr>
-          <w:hyperlink w:anchor="_Toc234018813" w:history="1">
+          <w:hyperlink w:anchor="_Toc234054698" w:history="1">
             <w:r>
               <w:rPr>
                 <w:rStyle w:val="Lienhypertexte"/>
@@ -5421,7 +5421,7 @@
                 <w:noProof/>
                 <w:webHidden/>
               </w:rPr>
-              <w:instrText xml:space="preserve"> PAGEREF _Toc234018813 \h </w:instrText>
+              <w:instrText xml:space="preserve"> PAGEREF _Toc234054698 \h </w:instrText>
             </w:r>
             <w:r>
               <w:rPr>
@@ -5463,7 +5463,7 @@
               <w:noProof/>
             </w:rPr>
           </w:pPr>
-          <w:hyperlink w:anchor="_Toc234018814" w:history="1">
+          <w:hyperlink w:anchor="_Toc234054699" w:history="1">
             <w:r>
               <w:rPr>
                 <w:rStyle w:val="Lienhypertexte"/>
@@ -5490,7 +5490,7 @@
                 <w:noProof/>
                 <w:webHidden/>
               </w:rPr>
-              <w:instrText xml:space="preserve"> PAGEREF _Toc234018814 \h </w:instrText>
+              <w:instrText xml:space="preserve"> PAGEREF _Toc234054699 \h </w:instrText>
             </w:r>
             <w:r>
               <w:rPr>
@@ -5532,7 +5532,7 @@
               <w:noProof/>
             </w:rPr>
           </w:pPr>
-          <w:hyperlink w:anchor="_Toc234018815" w:history="1">
+          <w:hyperlink w:anchor="_Toc234054700" w:history="1">
             <w:r>
               <w:rPr>
                 <w:rStyle w:val="Lienhypertexte"/>
@@ -5559,7 +5559,7 @@
                 <w:noProof/>
                 <w:webHidden/>
               </w:rPr>
-              <w:instrText xml:space="preserve"> PAGEREF _Toc234018815 \h </w:instrText>
+              <w:instrText xml:space="preserve"> PAGEREF _Toc234054700 \h </w:instrText>
             </w:r>
             <w:r>
               <w:rPr>
@@ -5601,7 +5601,7 @@
               <w:noProof/>
             </w:rPr>
           </w:pPr>
-          <w:hyperlink w:anchor="_Toc234018816" w:history="1">
+          <w:hyperlink w:anchor="_Toc234054701" w:history="1">
             <w:r>
               <w:rPr>
                 <w:rStyle w:val="Lienhypertexte"/>
@@ -5628,7 +5628,7 @@
                 <w:noProof/>
                 <w:webHidden/>
               </w:rPr>
-              <w:instrText xml:space="preserve"> PAGEREF _Toc234018816 \h </w:instrText>
+              <w:instrText xml:space="preserve"> PAGEREF _Toc234054701 \h </w:instrText>
             </w:r>
             <w:r>
               <w:rPr>
@@ -5670,7 +5670,7 @@
               <w:noProof/>
             </w:rPr>
           </w:pPr>
-          <w:hyperlink w:anchor="_Toc234018817" w:history="1">
+          <w:hyperlink w:anchor="_Toc234054702" w:history="1">
             <w:r>
               <w:rPr>
                 <w:rStyle w:val="Lienhypertexte"/>
@@ -5697,7 +5697,7 @@
                 <w:noProof/>
                 <w:webHidden/>
               </w:rPr>
-              <w:instrText xml:space="preserve"> PAGEREF _Toc234018817 \h </w:instrText>
+              <w:instrText xml:space="preserve"> PAGEREF _Toc234054702 \h </w:instrText>
             </w:r>
             <w:r>
               <w:rPr>
@@ -5739,7 +5739,7 @@
               <w:noProof/>
             </w:rPr>
           </w:pPr>
-          <w:hyperlink w:anchor="_Toc234018818" w:history="1">
+          <w:hyperlink w:anchor="_Toc234054703" w:history="1">
             <w:r>
               <w:rPr>
                 <w:rStyle w:val="Lienhypertexte"/>
@@ -5766,7 +5766,7 @@
                 <w:noProof/>
                 <w:webHidden/>
               </w:rPr>
-              <w:instrText xml:space="preserve"> PAGEREF _Toc234018818 \h </w:instrText>
+              <w:instrText xml:space="preserve"> PAGEREF _Toc234054703 \h </w:instrText>
             </w:r>
             <w:r>
               <w:rPr>
@@ -5808,7 +5808,7 @@
               <w:noProof/>
             </w:rPr>
           </w:pPr>
-          <w:hyperlink w:anchor="_Toc234018819" w:history="1">
+          <w:hyperlink w:anchor="_Toc234054704" w:history="1">
             <w:r>
               <w:rPr>
                 <w:rStyle w:val="Lienhypertexte"/>
@@ -5816,8 +5816,6 @@
               </w:rPr>
               <w:t>4.14 Database Implementation</w:t>
             </w:r>
-            <w:bookmarkStart w:id="2" w:name="_GoBack"/>
-            <w:bookmarkEnd w:id="2"/>
             <w:r>
               <w:rPr>
                 <w:noProof/>
@@ -5837,7 +5835,7 @@
                 <w:noProof/>
                 <w:webHidden/>
               </w:rPr>
-              <w:instrText xml:space="preserve"> PAGEREF _Toc234018819 \h </w:instrText>
+              <w:instrText xml:space="preserve"> PAGEREF _Toc234054704 \h </w:instrText>
             </w:r>
             <w:r>
               <w:rPr>
@@ -5879,7 +5877,7 @@
               <w:noProof/>
             </w:rPr>
           </w:pPr>
-          <w:hyperlink w:anchor="_Toc234018820" w:history="1">
+          <w:hyperlink w:anchor="_Toc234054705" w:history="1">
             <w:r>
               <w:rPr>
                 <w:rStyle w:val="Lienhypertexte"/>
@@ -5906,7 +5904,7 @@
                 <w:noProof/>
                 <w:webHidden/>
               </w:rPr>
-              <w:instrText xml:space="preserve"> PAGEREF _Toc234018820 \h </w:instrText>
+              <w:instrText xml:space="preserve"> PAGEREF _Toc234054705 \h </w:instrText>
             </w:r>
             <w:r>
               <w:rPr>
@@ -5948,7 +5946,7 @@
               <w:noProof/>
             </w:rPr>
           </w:pPr>
-          <w:hyperlink w:anchor="_Toc234018821" w:history="1">
+          <w:hyperlink w:anchor="_Toc234054706" w:history="1">
             <w:r>
               <w:rPr>
                 <w:rStyle w:val="Lienhypertexte"/>
@@ -5975,7 +5973,7 @@
                 <w:noProof/>
                 <w:webHidden/>
               </w:rPr>
-              <w:instrText xml:space="preserve"> PAGEREF _Toc234018821 \h </w:instrText>
+              <w:instrText xml:space="preserve"> PAGEREF _Toc234054706 \h </w:instrText>
             </w:r>
             <w:r>
               <w:rPr>
@@ -6017,7 +6015,7 @@
               <w:noProof/>
             </w:rPr>
           </w:pPr>
-          <w:hyperlink w:anchor="_Toc234018822" w:history="1">
+          <w:hyperlink w:anchor="_Toc234054707" w:history="1">
             <w:r>
               <w:rPr>
                 <w:rStyle w:val="Lienhypertexte"/>
@@ -6044,7 +6042,7 @@
                 <w:noProof/>
                 <w:webHidden/>
               </w:rPr>
-              <w:instrText xml:space="preserve"> PAGEREF _Toc234018822 \h </w:instrText>
+              <w:instrText xml:space="preserve"> PAGEREF _Toc234054707 \h </w:instrText>
             </w:r>
             <w:r>
               <w:rPr>
@@ -6086,7 +6084,7 @@
               <w:noProof/>
             </w:rPr>
           </w:pPr>
-          <w:hyperlink w:anchor="_Toc234018823" w:history="1">
+          <w:hyperlink w:anchor="_Toc234054708" w:history="1">
             <w:r>
               <w:rPr>
                 <w:rStyle w:val="Lienhypertexte"/>
@@ -6113,7 +6111,7 @@
                 <w:noProof/>
                 <w:webHidden/>
               </w:rPr>
-              <w:instrText xml:space="preserve"> PAGEREF _Toc234018823 \h </w:instrText>
+              <w:instrText xml:space="preserve"> PAGEREF _Toc234054708 \h </w:instrText>
             </w:r>
             <w:r>
               <w:rPr>
@@ -6155,7 +6153,7 @@
               <w:noProof/>
             </w:rPr>
           </w:pPr>
-          <w:hyperlink w:anchor="_Toc234018824" w:history="1">
+          <w:hyperlink w:anchor="_Toc234054709" w:history="1">
             <w:r>
               <w:rPr>
                 <w:rStyle w:val="Lienhypertexte"/>
@@ -6182,7 +6180,7 @@
                 <w:noProof/>
                 <w:webHidden/>
               </w:rPr>
-              <w:instrText xml:space="preserve"> PAGEREF _Toc234018824 \h </w:instrText>
+              <w:instrText xml:space="preserve"> PAGEREF _Toc234054709 \h </w:instrText>
             </w:r>
             <w:r>
               <w:rPr>
@@ -6224,7 +6222,7 @@
               <w:noProof/>
             </w:rPr>
           </w:pPr>
-          <w:hyperlink w:anchor="_Toc234018825" w:history="1">
+          <w:hyperlink w:anchor="_Toc234054710" w:history="1">
             <w:r>
               <w:rPr>
                 <w:rStyle w:val="Lienhypertexte"/>
@@ -6251,7 +6249,7 @@
                 <w:noProof/>
                 <w:webHidden/>
               </w:rPr>
-              <w:instrText xml:space="preserve"> PAGEREF _Toc234018825 \h </w:instrText>
+              <w:instrText xml:space="preserve"> PAGEREF _Toc234054710 \h </w:instrText>
             </w:r>
             <w:r>
               <w:rPr>
@@ -6293,7 +6291,7 @@
               <w:noProof/>
             </w:rPr>
           </w:pPr>
-          <w:hyperlink w:anchor="_Toc234018826" w:history="1">
+          <w:hyperlink w:anchor="_Toc234054711" w:history="1">
             <w:r>
               <w:rPr>
                 <w:rStyle w:val="Lienhypertexte"/>
@@ -6320,7 +6318,7 @@
                 <w:noProof/>
                 <w:webHidden/>
               </w:rPr>
-              <w:instrText xml:space="preserve"> PAGEREF _Toc234018826 \h </w:instrText>
+              <w:instrText xml:space="preserve"> PAGEREF _Toc234054711 \h </w:instrText>
             </w:r>
             <w:r>
               <w:rPr>
@@ -6362,7 +6360,7 @@
               <w:noProof/>
             </w:rPr>
           </w:pPr>
-          <w:hyperlink w:anchor="_Toc234018827" w:history="1">
+          <w:hyperlink w:anchor="_Toc234054712" w:history="1">
             <w:r>
               <w:rPr>
                 <w:rStyle w:val="Lienhypertexte"/>
@@ -6389,7 +6387,7 @@
                 <w:noProof/>
                 <w:webHidden/>
               </w:rPr>
-              <w:instrText xml:space="preserve"> PAGEREF _Toc234018827 \h </w:instrText>
+              <w:instrText xml:space="preserve"> PAGEREF _Toc234054712 \h </w:instrText>
             </w:r>
             <w:r>
               <w:rPr>
@@ -6431,7 +6429,7 @@
               <w:noProof/>
             </w:rPr>
           </w:pPr>
-          <w:hyperlink w:anchor="_Toc234018828" w:history="1">
+          <w:hyperlink w:anchor="_Toc234054713" w:history="1">
             <w:r>
               <w:rPr>
                 <w:rStyle w:val="Lienhypertexte"/>
@@ -6458,7 +6456,7 @@
                 <w:noProof/>
                 <w:webHidden/>
               </w:rPr>
-              <w:instrText xml:space="preserve"> PAGEREF _Toc234018828 \h </w:instrText>
+              <w:instrText xml:space="preserve"> PAGEREF _Toc234054713 \h </w:instrText>
             </w:r>
             <w:r>
               <w:rPr>
@@ -6500,7 +6498,7 @@
               <w:noProof/>
             </w:rPr>
           </w:pPr>
-          <w:hyperlink w:anchor="_Toc234018829" w:history="1">
+          <w:hyperlink w:anchor="_Toc234054714" w:history="1">
             <w:r>
               <w:rPr>
                 <w:rStyle w:val="Lienhypertexte"/>
@@ -6527,7 +6525,7 @@
                 <w:noProof/>
                 <w:webHidden/>
               </w:rPr>
-              <w:instrText xml:space="preserve"> PAGEREF _Toc234018829 \h </w:instrText>
+              <w:instrText xml:space="preserve"> PAGEREF _Toc234054714 \h </w:instrText>
             </w:r>
             <w:r>
               <w:rPr>
@@ -6569,7 +6567,7 @@
               <w:noProof/>
             </w:rPr>
           </w:pPr>
-          <w:hyperlink w:anchor="_Toc234018830" w:history="1">
+          <w:hyperlink w:anchor="_Toc234054715" w:history="1">
             <w:r>
               <w:rPr>
                 <w:rStyle w:val="Lienhypertexte"/>
@@ -6596,7 +6594,7 @@
                 <w:noProof/>
                 <w:webHidden/>
               </w:rPr>
-              <w:instrText xml:space="preserve"> PAGEREF _Toc234018830 \h </w:instrText>
+              <w:instrText xml:space="preserve"> PAGEREF _Toc234054715 \h </w:instrText>
             </w:r>
             <w:r>
               <w:rPr>
@@ -6638,7 +6636,7 @@
               <w:noProof/>
             </w:rPr>
           </w:pPr>
-          <w:hyperlink w:anchor="_Toc234018831" w:history="1">
+          <w:hyperlink w:anchor="_Toc234054716" w:history="1">
             <w:r>
               <w:rPr>
                 <w:rStyle w:val="Lienhypertexte"/>
@@ -6665,7 +6663,7 @@
                 <w:noProof/>
                 <w:webHidden/>
               </w:rPr>
-              <w:instrText xml:space="preserve"> PAGEREF _Toc234018831 \h </w:instrText>
+              <w:instrText xml:space="preserve"> PAGEREF _Toc234054716 \h </w:instrText>
             </w:r>
             <w:r>
               <w:rPr>
@@ -6707,7 +6705,7 @@
               <w:noProof/>
             </w:rPr>
           </w:pPr>
-          <w:hyperlink w:anchor="_Toc234018832" w:history="1">
+          <w:hyperlink w:anchor="_Toc234054717" w:history="1">
             <w:r>
               <w:rPr>
                 <w:rStyle w:val="Lienhypertexte"/>
@@ -6734,7 +6732,7 @@
                 <w:noProof/>
                 <w:webHidden/>
               </w:rPr>
-              <w:instrText xml:space="preserve"> PAGEREF _Toc234018832 \h </w:instrText>
+              <w:instrText xml:space="preserve"> PAGEREF _Toc234054717 \h </w:instrText>
             </w:r>
             <w:r>
               <w:rPr>
@@ -6776,7 +6774,7 @@
               <w:noProof/>
             </w:rPr>
           </w:pPr>
-          <w:hyperlink w:anchor="_Toc234018833" w:history="1">
+          <w:hyperlink w:anchor="_Toc234054718" w:history="1">
             <w:r>
               <w:rPr>
                 <w:rStyle w:val="Lienhypertexte"/>
@@ -6805,7 +6803,7 @@
                 <w:noProof/>
                 <w:webHidden/>
               </w:rPr>
-              <w:instrText xml:space="preserve"> PAGEREF _Toc234018833 \h </w:instrText>
+              <w:instrText xml:space="preserve"> PAGEREF _Toc234054718 \h </w:instrText>
             </w:r>
             <w:r>
               <w:rPr>
@@ -6847,7 +6845,7 @@
               <w:noProof/>
             </w:rPr>
           </w:pPr>
-          <w:hyperlink w:anchor="_Toc234018834" w:history="1">
+          <w:hyperlink w:anchor="_Toc234054719" w:history="1">
             <w:r>
               <w:rPr>
                 <w:rStyle w:val="Lienhypertexte"/>
@@ -6874,7 +6872,7 @@
                 <w:noProof/>
                 <w:webHidden/>
               </w:rPr>
-              <w:instrText xml:space="preserve"> PAGEREF _Toc234018834 \h </w:instrText>
+              <w:instrText xml:space="preserve"> PAGEREF _Toc234054719 \h </w:instrText>
             </w:r>
             <w:r>
               <w:rPr>
@@ -6924,12 +6922,14 @@
       <w:r>
         <w:br w:type="page"/>
       </w:r>
+      <w:bookmarkStart w:id="2" w:name="_GoBack"/>
+      <w:bookmarkEnd w:id="2"/>
     </w:p>
     <w:p>
       <w:pPr>
         <w:pStyle w:val="Titre1"/>
       </w:pPr>
-      <w:bookmarkStart w:id="3" w:name="_Toc234018752"/>
+      <w:bookmarkStart w:id="3" w:name="_Toc234054637"/>
       <w:r>
         <w:lastRenderedPageBreak/>
         <w:t>List of Tables</w:t>
@@ -7397,7 +7397,7 @@
           <w:rFonts w:cs="Times New Roman"/>
         </w:rPr>
       </w:pPr>
-      <w:bookmarkStart w:id="4" w:name="_Toc234018753"/>
+      <w:bookmarkStart w:id="4" w:name="_Toc234054638"/>
       <w:r>
         <w:rPr>
           <w:rFonts w:cs="Times New Roman"/>
@@ -8531,7 +8531,7 @@
           <w:rFonts w:cs="Times New Roman"/>
         </w:rPr>
       </w:pPr>
-      <w:bookmarkStart w:id="5" w:name="_Toc234018754"/>
+      <w:bookmarkStart w:id="5" w:name="_Toc234054639"/>
       <w:r>
         <w:rPr>
           <w:rFonts w:cs="Times New Roman"/>
@@ -9311,7 +9311,7 @@
           <w:rFonts w:cs="Times New Roman"/>
         </w:rPr>
       </w:pPr>
-      <w:bookmarkStart w:id="6" w:name="_Toc234018755"/>
+      <w:bookmarkStart w:id="6" w:name="_Toc234054640"/>
       <w:r>
         <w:rPr>
           <w:rFonts w:cs="Times New Roman"/>
@@ -9328,7 +9328,7 @@
           <w:rFonts w:cs="Times New Roman"/>
         </w:rPr>
       </w:pPr>
-      <w:bookmarkStart w:id="7" w:name="_Toc234018756"/>
+      <w:bookmarkStart w:id="7" w:name="_Toc234054641"/>
       <w:r>
         <w:rPr>
           <w:rFonts w:cs="Times New Roman"/>
@@ -9410,7 +9410,7 @@
           <w:rFonts w:cs="Times New Roman"/>
         </w:rPr>
       </w:pPr>
-      <w:bookmarkStart w:id="8" w:name="_Toc234018757"/>
+      <w:bookmarkStart w:id="8" w:name="_Toc234054642"/>
       <w:r>
         <w:rPr>
           <w:rFonts w:cs="Times New Roman"/>
@@ -9466,7 +9466,7 @@
           <w:rFonts w:cs="Times New Roman"/>
         </w:rPr>
       </w:pPr>
-      <w:bookmarkStart w:id="9" w:name="_Toc234018758"/>
+      <w:bookmarkStart w:id="9" w:name="_Toc234054643"/>
       <w:r>
         <w:rPr>
           <w:rFonts w:cs="Times New Roman"/>
@@ -9482,7 +9482,7 @@
           <w:rFonts w:cs="Times New Roman"/>
         </w:rPr>
       </w:pPr>
-      <w:bookmarkStart w:id="10" w:name="_Toc234018759"/>
+      <w:bookmarkStart w:id="10" w:name="_Toc234054644"/>
       <w:r>
         <w:rPr>
           <w:rFonts w:cs="Times New Roman"/>
@@ -9511,7 +9511,7 @@
           <w:rFonts w:cs="Times New Roman"/>
         </w:rPr>
       </w:pPr>
-      <w:bookmarkStart w:id="11" w:name="_Toc234018760"/>
+      <w:bookmarkStart w:id="11" w:name="_Toc234054645"/>
       <w:r>
         <w:rPr>
           <w:rFonts w:cs="Times New Roman"/>
@@ -9734,7 +9734,7 @@
           <w:rFonts w:cs="Times New Roman"/>
         </w:rPr>
       </w:pPr>
-      <w:bookmarkStart w:id="12" w:name="_Toc234018761"/>
+      <w:bookmarkStart w:id="12" w:name="_Toc234054646"/>
       <w:r>
         <w:rPr>
           <w:rFonts w:cs="Times New Roman"/>
@@ -9962,7 +9962,7 @@
           <w:rFonts w:cs="Times New Roman"/>
         </w:rPr>
       </w:pPr>
-      <w:bookmarkStart w:id="13" w:name="_Toc234018762"/>
+      <w:bookmarkStart w:id="13" w:name="_Toc234054647"/>
       <w:r>
         <w:rPr>
           <w:rFonts w:cs="Times New Roman"/>
@@ -10124,7 +10124,7 @@
           <w:rFonts w:cs="Times New Roman"/>
         </w:rPr>
       </w:pPr>
-      <w:bookmarkStart w:id="14" w:name="_Toc234018763"/>
+      <w:bookmarkStart w:id="14" w:name="_Toc234054648"/>
       <w:r>
         <w:rPr>
           <w:rFonts w:cs="Times New Roman"/>
@@ -10263,7 +10263,7 @@
           <w:rFonts w:cs="Times New Roman"/>
         </w:rPr>
       </w:pPr>
-      <w:bookmarkStart w:id="15" w:name="_Toc234018764"/>
+      <w:bookmarkStart w:id="15" w:name="_Toc234054649"/>
       <w:r>
         <w:rPr>
           <w:rFonts w:cs="Times New Roman"/>
@@ -10415,7 +10415,7 @@
           <w:rFonts w:cs="Times New Roman"/>
         </w:rPr>
       </w:pPr>
-      <w:bookmarkStart w:id="16" w:name="_Toc234018765"/>
+      <w:bookmarkStart w:id="16" w:name="_Toc234054650"/>
       <w:r>
         <w:rPr>
           <w:rFonts w:cs="Times New Roman"/>
@@ -10458,7 +10458,7 @@
           <w:rFonts w:cs="Times New Roman"/>
         </w:rPr>
       </w:pPr>
-      <w:bookmarkStart w:id="17" w:name="_Toc234018766"/>
+      <w:bookmarkStart w:id="17" w:name="_Toc234054651"/>
       <w:r>
         <w:rPr>
           <w:rFonts w:cs="Times New Roman"/>
@@ -10621,7 +10621,7 @@
           <w:rFonts w:cs="Times New Roman"/>
         </w:rPr>
       </w:pPr>
-      <w:bookmarkStart w:id="18" w:name="_Toc234018767"/>
+      <w:bookmarkStart w:id="18" w:name="_Toc234054652"/>
       <w:r>
         <w:rPr>
           <w:rFonts w:cs="Times New Roman"/>
@@ -10657,7 +10657,7 @@
           <w:rFonts w:cs="Times New Roman"/>
         </w:rPr>
       </w:pPr>
-      <w:bookmarkStart w:id="19" w:name="_Toc234018768"/>
+      <w:bookmarkStart w:id="19" w:name="_Toc234054653"/>
       <w:r>
         <w:rPr>
           <w:rFonts w:cs="Times New Roman"/>
@@ -10674,7 +10674,7 @@
           <w:rFonts w:cs="Times New Roman"/>
         </w:rPr>
       </w:pPr>
-      <w:bookmarkStart w:id="20" w:name="_Toc234018769"/>
+      <w:bookmarkStart w:id="20" w:name="_Toc234054654"/>
       <w:r>
         <w:rPr>
           <w:rFonts w:cs="Times New Roman"/>
@@ -10703,7 +10703,7 @@
           <w:rFonts w:cs="Times New Roman"/>
         </w:rPr>
       </w:pPr>
-      <w:bookmarkStart w:id="21" w:name="_Toc234018770"/>
+      <w:bookmarkStart w:id="21" w:name="_Toc234054655"/>
       <w:r>
         <w:rPr>
           <w:rFonts w:cs="Times New Roman"/>
@@ -10784,7 +10784,7 @@
           <w:rFonts w:cs="Times New Roman"/>
         </w:rPr>
       </w:pPr>
-      <w:bookmarkStart w:id="22" w:name="_Toc234018771"/>
+      <w:bookmarkStart w:id="22" w:name="_Toc234054656"/>
       <w:r>
         <w:rPr>
           <w:rFonts w:cs="Times New Roman"/>
@@ -10937,7 +10937,7 @@
           <w:rFonts w:cs="Times New Roman"/>
         </w:rPr>
       </w:pPr>
-      <w:bookmarkStart w:id="23" w:name="_Toc234018772"/>
+      <w:bookmarkStart w:id="23" w:name="_Toc234054657"/>
       <w:r>
         <w:rPr>
           <w:rFonts w:cs="Times New Roman"/>
@@ -11099,7 +11099,7 @@
           <w:rFonts w:cs="Times New Roman"/>
         </w:rPr>
       </w:pPr>
-      <w:bookmarkStart w:id="24" w:name="_Toc234018773"/>
+      <w:bookmarkStart w:id="24" w:name="_Toc234054658"/>
       <w:r>
         <w:rPr>
           <w:rFonts w:cs="Times New Roman"/>
@@ -11174,7 +11174,7 @@
           <w:rFonts w:cs="Times New Roman"/>
         </w:rPr>
       </w:pPr>
-      <w:bookmarkStart w:id="25" w:name="_Toc234018774"/>
+      <w:bookmarkStart w:id="25" w:name="_Toc234054659"/>
       <w:r>
         <w:rPr>
           <w:rFonts w:cs="Times New Roman"/>
@@ -11357,7 +11357,7 @@
           <w:rFonts w:cs="Times New Roman"/>
         </w:rPr>
       </w:pPr>
-      <w:bookmarkStart w:id="26" w:name="_Toc234018775"/>
+      <w:bookmarkStart w:id="26" w:name="_Toc234054660"/>
       <w:r>
         <w:rPr>
           <w:rFonts w:cs="Times New Roman"/>
@@ -11567,7 +11567,7 @@
           <w:rFonts w:cs="Times New Roman"/>
         </w:rPr>
       </w:pPr>
-      <w:bookmarkStart w:id="27" w:name="_Toc234018776"/>
+      <w:bookmarkStart w:id="27" w:name="_Toc234054661"/>
       <w:r>
         <w:rPr>
           <w:rFonts w:cs="Times New Roman"/>
@@ -11609,7 +11609,7 @@
           <w:rFonts w:cs="Times New Roman"/>
         </w:rPr>
       </w:pPr>
-      <w:bookmarkStart w:id="28" w:name="_Toc234018777"/>
+      <w:bookmarkStart w:id="28" w:name="_Toc234054662"/>
       <w:r>
         <w:rPr>
           <w:rFonts w:cs="Times New Roman"/>
@@ -11640,7 +11640,7 @@
           <w:bCs/>
         </w:rPr>
       </w:pPr>
-      <w:bookmarkStart w:id="29" w:name="_Toc234018778"/>
+      <w:bookmarkStart w:id="29" w:name="_Toc234054663"/>
       <w:r>
         <w:rPr>
           <w:rFonts w:cs="Times New Roman"/>
@@ -11659,7 +11659,7 @@
           <w:rFonts w:cs="Times New Roman"/>
         </w:rPr>
       </w:pPr>
-      <w:bookmarkStart w:id="30" w:name="_Toc234018779"/>
+      <w:bookmarkStart w:id="30" w:name="_Toc234054664"/>
       <w:r>
         <w:rPr>
           <w:rFonts w:cs="Times New Roman"/>
@@ -11688,7 +11688,7 @@
           <w:rFonts w:cs="Times New Roman"/>
         </w:rPr>
       </w:pPr>
-      <w:bookmarkStart w:id="31" w:name="_Toc234018780"/>
+      <w:bookmarkStart w:id="31" w:name="_Toc234054665"/>
       <w:r>
         <w:rPr>
           <w:rFonts w:cs="Times New Roman"/>
@@ -12078,7 +12078,7 @@
           <w:rFonts w:cs="Times New Roman"/>
         </w:rPr>
       </w:pPr>
-      <w:bookmarkStart w:id="32" w:name="_Toc234018781"/>
+      <w:bookmarkStart w:id="32" w:name="_Toc234054666"/>
       <w:r>
         <w:rPr>
           <w:rFonts w:cs="Times New Roman"/>
@@ -12395,7 +12395,7 @@
           <w:rFonts w:cs="Times New Roman"/>
         </w:rPr>
       </w:pPr>
-      <w:bookmarkStart w:id="33" w:name="_Toc234018782"/>
+      <w:bookmarkStart w:id="33" w:name="_Toc234054667"/>
       <w:r>
         <w:rPr>
           <w:rFonts w:cs="Times New Roman"/>
@@ -12425,7 +12425,7 @@
           <w:rFonts w:cs="Times New Roman"/>
         </w:rPr>
       </w:pPr>
-      <w:bookmarkStart w:id="34" w:name="_Toc234018783"/>
+      <w:bookmarkStart w:id="34" w:name="_Toc234054668"/>
       <w:r>
         <w:rPr>
           <w:rFonts w:cs="Times New Roman"/>
@@ -12577,7 +12577,7 @@
           <w:rFonts w:cs="Times New Roman"/>
         </w:rPr>
       </w:pPr>
-      <w:bookmarkStart w:id="35" w:name="_Toc234018784"/>
+      <w:bookmarkStart w:id="35" w:name="_Toc234054669"/>
       <w:r>
         <w:rPr>
           <w:rFonts w:cs="Times New Roman"/>
@@ -12792,7 +12792,7 @@
           <w:rFonts w:cs="Times New Roman"/>
         </w:rPr>
       </w:pPr>
-      <w:bookmarkStart w:id="36" w:name="_Toc234018785"/>
+      <w:bookmarkStart w:id="36" w:name="_Toc234054670"/>
       <w:r>
         <w:rPr>
           <w:rFonts w:cs="Times New Roman"/>
@@ -12921,7 +12921,7 @@
           <w:rFonts w:cs="Times New Roman"/>
         </w:rPr>
       </w:pPr>
-      <w:bookmarkStart w:id="37" w:name="_Toc234018786"/>
+      <w:bookmarkStart w:id="37" w:name="_Toc234054671"/>
       <w:r>
         <w:rPr>
           <w:rFonts w:cs="Times New Roman"/>
@@ -13104,7 +13104,7 @@
           <w:rFonts w:cs="Times New Roman"/>
         </w:rPr>
       </w:pPr>
-      <w:bookmarkStart w:id="38" w:name="_Toc234018787"/>
+      <w:bookmarkStart w:id="38" w:name="_Toc234054672"/>
       <w:r>
         <w:rPr>
           <w:rFonts w:cs="Times New Roman"/>
@@ -13217,7 +13217,7 @@
           <w:rFonts w:cs="Times New Roman"/>
         </w:rPr>
       </w:pPr>
-      <w:bookmarkStart w:id="39" w:name="_Toc234018788"/>
+      <w:bookmarkStart w:id="39" w:name="_Toc234054673"/>
       <w:r>
         <w:rPr>
           <w:rFonts w:cs="Times New Roman"/>
@@ -13316,7 +13316,7 @@
           <w:rFonts w:cs="Times New Roman"/>
         </w:rPr>
       </w:pPr>
-      <w:bookmarkStart w:id="40" w:name="_Toc234018789"/>
+      <w:bookmarkStart w:id="40" w:name="_Toc234054674"/>
       <w:r>
         <w:rPr>
           <w:rFonts w:cs="Times New Roman"/>
@@ -13345,7 +13345,7 @@
           <w:rFonts w:cs="Times New Roman"/>
         </w:rPr>
       </w:pPr>
-      <w:bookmarkStart w:id="41" w:name="_Toc234018790"/>
+      <w:bookmarkStart w:id="41" w:name="_Toc234054675"/>
       <w:r>
         <w:rPr>
           <w:rFonts w:cs="Times New Roman"/>
@@ -13407,7 +13407,7 @@
           <w:rFonts w:cs="Times New Roman"/>
         </w:rPr>
       </w:pPr>
-      <w:bookmarkStart w:id="42" w:name="_Toc234018791"/>
+      <w:bookmarkStart w:id="42" w:name="_Toc234054676"/>
       <w:r>
         <w:rPr>
           <w:rFonts w:cs="Times New Roman"/>
@@ -14067,7 +14067,7 @@
           <w:rFonts w:cs="Times New Roman"/>
         </w:rPr>
       </w:pPr>
-      <w:bookmarkStart w:id="43" w:name="_Toc234018792"/>
+      <w:bookmarkStart w:id="43" w:name="_Toc234054677"/>
       <w:r>
         <w:rPr>
           <w:rFonts w:cs="Times New Roman"/>
@@ -14547,7 +14547,7 @@
           <w:rFonts w:cs="Times New Roman"/>
         </w:rPr>
       </w:pPr>
-      <w:bookmarkStart w:id="44" w:name="_Toc234018793"/>
+      <w:bookmarkStart w:id="44" w:name="_Toc234054678"/>
       <w:r>
         <w:rPr>
           <w:rFonts w:cs="Times New Roman"/>
@@ -14789,7 +14789,7 @@
           <w:rFonts w:cs="Times New Roman"/>
         </w:rPr>
       </w:pPr>
-      <w:bookmarkStart w:id="45" w:name="_Toc234018794"/>
+      <w:bookmarkStart w:id="45" w:name="_Toc234054679"/>
       <w:r>
         <w:rPr>
           <w:rFonts w:cs="Times New Roman"/>
@@ -14818,7 +14818,7 @@
           <w:rFonts w:cs="Times New Roman"/>
         </w:rPr>
       </w:pPr>
-      <w:bookmarkStart w:id="46" w:name="_Toc234018795"/>
+      <w:bookmarkStart w:id="46" w:name="_Toc234054680"/>
       <w:r>
         <w:rPr>
           <w:rFonts w:cs="Times New Roman"/>
@@ -14848,7 +14848,7 @@
           <w:rFonts w:cs="Times New Roman"/>
         </w:rPr>
       </w:pPr>
-      <w:bookmarkStart w:id="47" w:name="_Toc234018796"/>
+      <w:bookmarkStart w:id="47" w:name="_Toc234054681"/>
       <w:r>
         <w:rPr>
           <w:rFonts w:cs="Times New Roman"/>
@@ -14997,7 +14997,7 @@
           <w:rFonts w:cs="Times New Roman"/>
         </w:rPr>
       </w:pPr>
-      <w:bookmarkStart w:id="48" w:name="_Toc234018797"/>
+      <w:bookmarkStart w:id="48" w:name="_Toc234054682"/>
       <w:r>
         <w:rPr>
           <w:rFonts w:cs="Times New Roman"/>
@@ -15223,7 +15223,7 @@
           <w:rFonts w:cs="Times New Roman"/>
         </w:rPr>
       </w:pPr>
-      <w:bookmarkStart w:id="49" w:name="_Toc234018798"/>
+      <w:bookmarkStart w:id="49" w:name="_Toc234054683"/>
       <w:r>
         <w:rPr>
           <w:rFonts w:cs="Times New Roman"/>
@@ -15643,7 +15643,7 @@
           <w:rFonts w:cs="Times New Roman"/>
         </w:rPr>
       </w:pPr>
-      <w:bookmarkStart w:id="50" w:name="_Toc234018799"/>
+      <w:bookmarkStart w:id="50" w:name="_Toc234054684"/>
       <w:r>
         <w:rPr>
           <w:rFonts w:cs="Times New Roman"/>
@@ -15880,7 +15880,7 @@
           <w:rFonts w:cs="Times New Roman"/>
         </w:rPr>
       </w:pPr>
-      <w:bookmarkStart w:id="51" w:name="_Toc234018800"/>
+      <w:bookmarkStart w:id="51" w:name="_Toc234054685"/>
       <w:r>
         <w:rPr>
           <w:rFonts w:cs="Times New Roman"/>
@@ -16204,7 +16204,7 @@
           <w:rFonts w:cs="Times New Roman"/>
         </w:rPr>
       </w:pPr>
-      <w:bookmarkStart w:id="52" w:name="_Toc234018801"/>
+      <w:bookmarkStart w:id="52" w:name="_Toc234054686"/>
       <w:r>
         <w:rPr>
           <w:rFonts w:cs="Times New Roman"/>
@@ -16544,7 +16544,7 @@
           <w:rFonts w:cs="Times New Roman"/>
         </w:rPr>
       </w:pPr>
-      <w:bookmarkStart w:id="53" w:name="_Toc234018802"/>
+      <w:bookmarkStart w:id="53" w:name="_Toc234054687"/>
       <w:r>
         <w:rPr>
           <w:rFonts w:cs="Times New Roman"/>
@@ -16800,7 +16800,7 @@
           <w:rFonts w:cs="Times New Roman"/>
         </w:rPr>
       </w:pPr>
-      <w:bookmarkStart w:id="54" w:name="_Toc234018803"/>
+      <w:bookmarkStart w:id="54" w:name="_Toc234054688"/>
       <w:r>
         <w:rPr>
           <w:rFonts w:cs="Times New Roman"/>
@@ -16976,7 +16976,7 @@
           <w:rFonts w:cs="Times New Roman"/>
         </w:rPr>
       </w:pPr>
-      <w:bookmarkStart w:id="55" w:name="_Toc234018804"/>
+      <w:bookmarkStart w:id="55" w:name="_Toc234054689"/>
       <w:r>
         <w:rPr>
           <w:rFonts w:cs="Times New Roman"/>
@@ -17018,7 +17018,7 @@
           <w:rFonts w:cs="Times New Roman"/>
         </w:rPr>
       </w:pPr>
-      <w:bookmarkStart w:id="56" w:name="_Toc234018805"/>
+      <w:bookmarkStart w:id="56" w:name="_Toc234054690"/>
       <w:r>
         <w:rPr>
           <w:rFonts w:cs="Times New Roman"/>
@@ -17075,7 +17075,7 @@
           <w:rFonts w:cs="Times New Roman"/>
         </w:rPr>
       </w:pPr>
-      <w:bookmarkStart w:id="57" w:name="_Toc234018806"/>
+      <w:bookmarkStart w:id="57" w:name="_Toc234054691"/>
       <w:r>
         <w:rPr>
           <w:rFonts w:cs="Times New Roman"/>
@@ -17092,7 +17092,7 @@
           <w:rFonts w:cs="Times New Roman"/>
         </w:rPr>
       </w:pPr>
-      <w:bookmarkStart w:id="58" w:name="_Toc234018807"/>
+      <w:bookmarkStart w:id="58" w:name="_Toc234054692"/>
       <w:r>
         <w:rPr>
           <w:rFonts w:cs="Times New Roman"/>
@@ -17121,7 +17121,7 @@
           <w:rFonts w:cs="Times New Roman"/>
         </w:rPr>
       </w:pPr>
-      <w:bookmarkStart w:id="59" w:name="_Toc234018808"/>
+      <w:bookmarkStart w:id="59" w:name="_Toc234054693"/>
       <w:r>
         <w:rPr>
           <w:rFonts w:cs="Times New Roman"/>
@@ -17989,7 +17989,7 @@
           <w:rFonts w:cs="Times New Roman"/>
         </w:rPr>
       </w:pPr>
-      <w:bookmarkStart w:id="60" w:name="_Toc234018809"/>
+      <w:bookmarkStart w:id="60" w:name="_Toc234054694"/>
       <w:r>
         <w:rPr>
           <w:rFonts w:cs="Times New Roman"/>
@@ -18106,7 +18106,7 @@
           <w:rFonts w:cs="Times New Roman"/>
         </w:rPr>
       </w:pPr>
-      <w:bookmarkStart w:id="61" w:name="_Toc234018810"/>
+      <w:bookmarkStart w:id="61" w:name="_Toc234054695"/>
       <w:r>
         <w:rPr>
           <w:rFonts w:cs="Times New Roman"/>
@@ -18329,7 +18329,7 @@
           <w:rFonts w:cs="Times New Roman"/>
         </w:rPr>
       </w:pPr>
-      <w:bookmarkStart w:id="62" w:name="_Toc234018811"/>
+      <w:bookmarkStart w:id="62" w:name="_Toc234054696"/>
       <w:r>
         <w:rPr>
           <w:rFonts w:cs="Times New Roman"/>
@@ -18569,7 +18569,7 @@
           <w:rFonts w:cs="Times New Roman"/>
         </w:rPr>
       </w:pPr>
-      <w:bookmarkStart w:id="63" w:name="_Toc234018812"/>
+      <w:bookmarkStart w:id="63" w:name="_Toc234054697"/>
       <w:r>
         <w:rPr>
           <w:rFonts w:cs="Times New Roman"/>
@@ -18672,7 +18672,7 @@
           <w:rFonts w:cs="Times New Roman"/>
         </w:rPr>
       </w:pPr>
-      <w:bookmarkStart w:id="64" w:name="_Toc234018813"/>
+      <w:bookmarkStart w:id="64" w:name="_Toc234054698"/>
       <w:r>
         <w:rPr>
           <w:rFonts w:cs="Times New Roman"/>
@@ -18914,7 +18914,7 @@
           <w:rFonts w:cs="Times New Roman"/>
         </w:rPr>
       </w:pPr>
-      <w:bookmarkStart w:id="65" w:name="_Toc234018814"/>
+      <w:bookmarkStart w:id="65" w:name="_Toc234054699"/>
       <w:r>
         <w:rPr>
           <w:rFonts w:cs="Times New Roman"/>
@@ -19265,7 +19265,7 @@
           <w:rFonts w:cs="Times New Roman"/>
         </w:rPr>
       </w:pPr>
-      <w:bookmarkStart w:id="66" w:name="_Toc234018815"/>
+      <w:bookmarkStart w:id="66" w:name="_Toc234054700"/>
       <w:r>
         <w:rPr>
           <w:rFonts w:cs="Times New Roman"/>
@@ -19308,7 +19308,7 @@
           <w:rFonts w:cs="Times New Roman"/>
         </w:rPr>
       </w:pPr>
-      <w:bookmarkStart w:id="67" w:name="_Toc234018816"/>
+      <w:bookmarkStart w:id="67" w:name="_Toc234054701"/>
       <w:r>
         <w:rPr>
           <w:rFonts w:cs="Times New Roman"/>
@@ -19580,7 +19580,7 @@
           <w:rFonts w:cs="Times New Roman"/>
         </w:rPr>
       </w:pPr>
-      <w:bookmarkStart w:id="68" w:name="_Toc234018817"/>
+      <w:bookmarkStart w:id="68" w:name="_Toc234054702"/>
       <w:r>
         <w:rPr>
           <w:rFonts w:cs="Times New Roman"/>
@@ -19767,7 +19767,7 @@
           <w:rFonts w:cs="Times New Roman"/>
         </w:rPr>
       </w:pPr>
-      <w:bookmarkStart w:id="69" w:name="_Toc234018818"/>
+      <w:bookmarkStart w:id="69" w:name="_Toc234054703"/>
       <w:r>
         <w:rPr>
           <w:rFonts w:cs="Times New Roman"/>
@@ -20504,7 +20504,7 @@
           <w:rFonts w:cs="Times New Roman"/>
         </w:rPr>
       </w:pPr>
-      <w:bookmarkStart w:id="70" w:name="_Toc234018819"/>
+      <w:bookmarkStart w:id="70" w:name="_Toc234054704"/>
       <w:r>
         <w:rPr>
           <w:rFonts w:cs="Times New Roman"/>
@@ -20585,7 +20585,7 @@
           <w:rFonts w:cs="Times New Roman"/>
         </w:rPr>
       </w:pPr>
-      <w:bookmarkStart w:id="71" w:name="_Toc234018820"/>
+      <w:bookmarkStart w:id="71" w:name="_Toc234054705"/>
       <w:r>
         <w:rPr>
           <w:rFonts w:cs="Times New Roman"/>
@@ -20627,7 +20627,7 @@
           <w:rFonts w:cs="Times New Roman"/>
         </w:rPr>
       </w:pPr>
-      <w:bookmarkStart w:id="72" w:name="_Toc234018821"/>
+      <w:bookmarkStart w:id="72" w:name="_Toc234054706"/>
       <w:r>
         <w:rPr>
           <w:rFonts w:cs="Times New Roman"/>
@@ -21014,7 +21014,7 @@
           <w:rFonts w:cs="Times New Roman"/>
         </w:rPr>
       </w:pPr>
-      <w:bookmarkStart w:id="73" w:name="_Toc234018822"/>
+      <w:bookmarkStart w:id="73" w:name="_Toc234054707"/>
       <w:r>
         <w:rPr>
           <w:rFonts w:cs="Times New Roman"/>
@@ -21122,7 +21122,7 @@
           <w:rFonts w:cs="Times New Roman"/>
         </w:rPr>
       </w:pPr>
-      <w:bookmarkStart w:id="74" w:name="_Toc234018823"/>
+      <w:bookmarkStart w:id="74" w:name="_Toc234054708"/>
       <w:r>
         <w:rPr>
           <w:rFonts w:cs="Times New Roman"/>
@@ -21464,7 +21464,7 @@
           <w:rFonts w:cs="Times New Roman"/>
         </w:rPr>
       </w:pPr>
-      <w:bookmarkStart w:id="75" w:name="_Toc234018824"/>
+      <w:bookmarkStart w:id="75" w:name="_Toc234054709"/>
       <w:r>
         <w:rPr>
           <w:rFonts w:cs="Times New Roman"/>
@@ -21584,7 +21584,7 @@
           <w:rFonts w:cs="Times New Roman"/>
         </w:rPr>
       </w:pPr>
-      <w:bookmarkStart w:id="76" w:name="_Toc234018825"/>
+      <w:bookmarkStart w:id="76" w:name="_Toc234054710"/>
       <w:r>
         <w:rPr>
           <w:rFonts w:cs="Times New Roman"/>
@@ -21601,7 +21601,7 @@
           <w:rFonts w:cs="Times New Roman"/>
         </w:rPr>
       </w:pPr>
-      <w:bookmarkStart w:id="77" w:name="_Toc234018826"/>
+      <w:bookmarkStart w:id="77" w:name="_Toc234054711"/>
       <w:r>
         <w:rPr>
           <w:rFonts w:cs="Times New Roman"/>
@@ -22154,7 +22154,7 @@
           <w:rFonts w:cs="Times New Roman"/>
         </w:rPr>
       </w:pPr>
-      <w:bookmarkStart w:id="78" w:name="_Toc234018827"/>
+      <w:bookmarkStart w:id="78" w:name="_Toc234054712"/>
       <w:r>
         <w:rPr>
           <w:rFonts w:cs="Times New Roman"/>
@@ -22196,7 +22196,7 @@
           <w:rFonts w:cs="Times New Roman"/>
         </w:rPr>
       </w:pPr>
-      <w:bookmarkStart w:id="79" w:name="_Toc234018828"/>
+      <w:bookmarkStart w:id="79" w:name="_Toc234054713"/>
       <w:r>
         <w:rPr>
           <w:rFonts w:cs="Times New Roman"/>
@@ -22238,7 +22238,7 @@
           <w:rFonts w:cs="Times New Roman"/>
         </w:rPr>
       </w:pPr>
-      <w:bookmarkStart w:id="80" w:name="_Toc234018829"/>
+      <w:bookmarkStart w:id="80" w:name="_Toc234054714"/>
       <w:r>
         <w:rPr>
           <w:rFonts w:cs="Times New Roman"/>
@@ -22400,7 +22400,7 @@
           <w:rFonts w:cs="Times New Roman"/>
         </w:rPr>
       </w:pPr>
-      <w:bookmarkStart w:id="81" w:name="_Toc234018830"/>
+      <w:bookmarkStart w:id="81" w:name="_Toc234054715"/>
       <w:r>
         <w:rPr>
           <w:rFonts w:cs="Times New Roman"/>
@@ -22539,7 +22539,7 @@
           <w:rFonts w:cs="Times New Roman"/>
         </w:rPr>
       </w:pPr>
-      <w:bookmarkStart w:id="82" w:name="_Toc234018831"/>
+      <w:bookmarkStart w:id="82" w:name="_Toc234054716"/>
       <w:r>
         <w:rPr>
           <w:rFonts w:cs="Times New Roman"/>
@@ -22745,7 +22745,7 @@
           <w:rFonts w:cs="Times New Roman"/>
         </w:rPr>
       </w:pPr>
-      <w:bookmarkStart w:id="83" w:name="_Toc234018832"/>
+      <w:bookmarkStart w:id="83" w:name="_Toc234054717"/>
       <w:r>
         <w:rPr>
           <w:rFonts w:cs="Times New Roman"/>
@@ -22797,7 +22797,7 @@
           <w:bCs/>
         </w:rPr>
       </w:pPr>
-      <w:bookmarkStart w:id="84" w:name="_Toc234018833"/>
+      <w:bookmarkStart w:id="84" w:name="_Toc234054718"/>
       <w:r>
         <w:rPr>
           <w:rFonts w:cs="Times New Roman"/>
@@ -22904,6 +22904,7 @@
       <w:pPr>
         <w:rPr>
           <w:rFonts w:cs="Times New Roman"/>
+          <w:lang w:val="fr-FR"/>
         </w:rPr>
       </w:pPr>
       <w:r>
@@ -22917,6 +22918,7 @@
           <w:rPr>
             <w:rStyle w:val="Lienhypertexte"/>
             <w:rFonts w:cs="Times New Roman"/>
+            <w:lang w:val="fr-FR"/>
           </w:rPr>
           <w:t>https://www.mongodb.com/docs</w:t>
         </w:r>
@@ -22926,13 +22928,13 @@
       <w:pPr>
         <w:rPr>
           <w:rFonts w:cs="Times New Roman"/>
+        </w:rPr>
+      </w:pPr>
+      <w:r>
+        <w:rPr>
+          <w:rFonts w:cs="Times New Roman"/>
           <w:lang w:val="fr-FR"/>
         </w:rPr>
-      </w:pPr>
-      <w:r>
-        <w:rPr>
-          <w:rFonts w:cs="Times New Roman"/>
-        </w:rPr>
         <w:t xml:space="preserve">Node.js. (2026). </w:t>
       </w:r>
       <w:r>
@@ -22940,14 +22942,19 @@
           <w:rFonts w:cs="Times New Roman"/>
           <w:lang w:val="fr-FR"/>
         </w:rPr>
-        <w:t>Node.js documentation. OpenJS Foundation. </w:t>
+        <w:t xml:space="preserve">Node.js documentation. </w:t>
+      </w:r>
+      <w:r>
+        <w:rPr>
+          <w:rFonts w:cs="Times New Roman"/>
+        </w:rPr>
+        <w:t>OpenJS Foundation. </w:t>
       </w:r>
       <w:hyperlink r:id="rId38" w:tgtFrame="_blank" w:history="1">
         <w:r>
           <w:rPr>
             <w:rStyle w:val="Lienhypertexte"/>
             <w:rFonts w:cs="Times New Roman"/>
-            <w:lang w:val="fr-FR"/>
           </w:rPr>
           <w:t>https://nodejs.org</w:t>
         </w:r>
@@ -23048,7 +23055,7 @@
           <w:rFonts w:cs="Times New Roman"/>
         </w:rPr>
       </w:pPr>
-      <w:bookmarkStart w:id="85" w:name="_Toc234018834"/>
+      <w:bookmarkStart w:id="85" w:name="_Toc234054719"/>
       <w:r>
         <w:rPr>
           <w:rFonts w:cs="Times New Roman"/>
@@ -23072,19 +23079,6 @@
           <w:bCs/>
         </w:rPr>
         <w:t>Appendix A: Screenshot Placement Checklist</w:t>
-      </w:r>
-    </w:p>
-    <w:p>
-      <w:pPr>
-        <w:rPr>
-          <w:rFonts w:cs="Times New Roman"/>
-        </w:rPr>
-      </w:pPr>
-      <w:r>
-        <w:rPr>
-          <w:rFonts w:cs="Times New Roman"/>
-        </w:rPr>
-        <w:t>Use the following screenshots in the final formatted Word/PDF version:</w:t>
       </w:r>
     </w:p>
     <w:p>
@@ -23106,7 +23100,13 @@
         <w:rPr>
           <w:rFonts w:cs="Times New Roman"/>
         </w:rPr>
-        <w:t>Login/register screen: place under Section 4.3.</w:t>
+        <w:t>Login/register screen:</w:t>
+      </w:r>
+      <w:r>
+        <w:rPr>
+          <w:rFonts w:cs="Times New Roman"/>
+        </w:rPr>
+        <w:t xml:space="preserve"> under Section 4.3.</w:t>
       </w:r>
     </w:p>
     <w:p>
@@ -23128,7 +23128,13 @@
         <w:rPr>
           <w:rFonts w:cs="Times New Roman"/>
         </w:rPr>
-        <w:t>Subscriber collect screen: place under Section 4.7.</w:t>
+        <w:t>Subscriber collect screen:</w:t>
+      </w:r>
+      <w:r>
+        <w:rPr>
+          <w:rFonts w:cs="Times New Roman"/>
+        </w:rPr>
+        <w:t xml:space="preserve"> under Section 4.7.</w:t>
       </w:r>
     </w:p>
     <w:p>
@@ -23150,7 +23156,13 @@
         <w:rPr>
           <w:rFonts w:cs="Times New Roman"/>
         </w:rPr>
-        <w:t>Latest sample details: place under Section 4.8.</w:t>
+        <w:t>Latest sample details:</w:t>
+      </w:r>
+      <w:r>
+        <w:rPr>
+          <w:rFonts w:cs="Times New Roman"/>
+        </w:rPr>
+        <w:t xml:space="preserve"> under Section 4.8.</w:t>
       </w:r>
     </w:p>
     <w:p>
@@ -23172,7 +23184,7 @@
         <w:rPr>
           <w:rFonts w:cs="Times New Roman"/>
         </w:rPr>
-        <w:t>Subscriber heatmap: place under Section 4.11.</w:t>
+        <w:t>Subscriber heatmap: under Section 4.11.</w:t>
       </w:r>
     </w:p>
     <w:p>
@@ -23194,7 +23206,19 @@
         <w:rPr>
           <w:rFonts w:cs="Times New Roman"/>
         </w:rPr>
-        <w:t>Subscriber records screen: place under Section 4.12.</w:t>
+        <w:t>S</w:t>
+      </w:r>
+      <w:r>
+        <w:rPr>
+          <w:rFonts w:cs="Times New Roman"/>
+        </w:rPr>
+        <w:t xml:space="preserve">ubscriber records screen: </w:t>
+      </w:r>
+      <w:r>
+        <w:rPr>
+          <w:rFonts w:cs="Times New Roman"/>
+        </w:rPr>
+        <w:t>under Section 4.12.</w:t>
       </w:r>
     </w:p>
     <w:p>
@@ -23216,7 +23240,19 @@
         <w:rPr>
           <w:rFonts w:cs="Times New Roman"/>
         </w:rPr>
-        <w:t>Settings and consent screen: place under Section 4.10.</w:t>
+        <w:t>Se</w:t>
+      </w:r>
+      <w:r>
+        <w:rPr>
+          <w:rFonts w:cs="Times New Roman"/>
+        </w:rPr>
+        <w:t>ttings and consent screen:</w:t>
+      </w:r>
+      <w:r>
+        <w:rPr>
+          <w:rFonts w:cs="Times New Roman"/>
+        </w:rPr>
+        <w:t xml:space="preserve"> under Section 4.10.</w:t>
       </w:r>
     </w:p>
     <w:p>
@@ -23238,7 +23274,13 @@
         <w:rPr>
           <w:rFonts w:cs="Times New Roman"/>
         </w:rPr>
-        <w:t>Admin dashboard: place under Section 4.16.</w:t>
+        <w:t xml:space="preserve">Admin dashboard: </w:t>
+      </w:r>
+      <w:r>
+        <w:rPr>
+          <w:rFonts w:cs="Times New Roman"/>
+        </w:rPr>
+        <w:t>under Section 4.16.</w:t>
       </w:r>
     </w:p>
     <w:p>
@@ -23260,7 +23302,13 @@
         <w:rPr>
           <w:rFonts w:cs="Times New Roman"/>
         </w:rPr>
-        <w:t>Admin heatmap: place under Section 4.11.</w:t>
+        <w:t xml:space="preserve">Admin heatmap: </w:t>
+      </w:r>
+      <w:r>
+        <w:rPr>
+          <w:rFonts w:cs="Times New Roman"/>
+        </w:rPr>
+        <w:t>under Section 4.11.</w:t>
       </w:r>
     </w:p>
     <w:p>
@@ -23282,7 +23330,19 @@
         <w:rPr>
           <w:rFonts w:cs="Times New Roman"/>
         </w:rPr>
-        <w:t>Admin records/filter screen: place under Section 4.16.</w:t>
+        <w:t>A</w:t>
+      </w:r>
+      <w:r>
+        <w:rPr>
+          <w:rFonts w:cs="Times New Roman"/>
+        </w:rPr>
+        <w:t>dmin records/filter screen:</w:t>
+      </w:r>
+      <w:r>
+        <w:rPr>
+          <w:rFonts w:cs="Times New Roman"/>
+        </w:rPr>
+        <w:t xml:space="preserve"> under Section 4.16.</w:t>
       </w:r>
     </w:p>
     <w:p>
@@ -23304,7 +23364,19 @@
         <w:rPr>
           <w:rFonts w:cs="Times New Roman"/>
         </w:rPr>
-        <w:t>MongoDB collections screenshot: place under Section 4.14.</w:t>
+        <w:t>Mongo</w:t>
+      </w:r>
+      <w:r>
+        <w:rPr>
+          <w:rFonts w:cs="Times New Roman"/>
+        </w:rPr>
+        <w:t>DB collections screenshot:</w:t>
+      </w:r>
+      <w:r>
+        <w:rPr>
+          <w:rFonts w:cs="Times New Roman"/>
+        </w:rPr>
+        <w:t xml:space="preserve"> under Section 4.14.</w:t>
       </w:r>
     </w:p>
     <w:p>
@@ -23326,7 +23398,19 @@
         <w:rPr>
           <w:rFonts w:cs="Times New Roman"/>
         </w:rPr>
-        <w:t>Backend terminal running successfully: place under Section 4.15.</w:t>
+        <w:t>Backend termi</w:t>
+      </w:r>
+      <w:r>
+        <w:rPr>
+          <w:rFonts w:cs="Times New Roman"/>
+        </w:rPr>
+        <w:t xml:space="preserve">nal running successfully: </w:t>
+      </w:r>
+      <w:r>
+        <w:rPr>
+          <w:rFonts w:cs="Times New Roman"/>
+        </w:rPr>
+        <w:t>under Section 4.15.</w:t>
       </w:r>
     </w:p>
     <w:p>
@@ -23348,7 +23432,19 @@
         <w:rPr>
           <w:rFonts w:cs="Times New Roman"/>
         </w:rPr>
-        <w:t>Expo app running on mobile device/emulator: place under Section 4.5.</w:t>
+        <w:t xml:space="preserve">Expo app running </w:t>
+      </w:r>
+      <w:r>
+        <w:rPr>
+          <w:rFonts w:cs="Times New Roman"/>
+        </w:rPr>
+        <w:t>on mobile device/emulator:</w:t>
+      </w:r>
+      <w:r>
+        <w:rPr>
+          <w:rFonts w:cs="Times New Roman"/>
+        </w:rPr>
+        <w:t xml:space="preserve"> under Section 4.5.</w:t>
       </w:r>
     </w:p>
     <w:p>
@@ -23365,7 +23461,7 @@
           <w:b/>
           <w:bCs/>
         </w:rPr>
-        <w:t>Appendix B: Suggested Diagrams to Draw</w:t>
+        <w:t xml:space="preserve">Appendix B: Diagrams </w:t>
       </w:r>
     </w:p>
     <w:p>
@@ -23409,7 +23505,6 @@
         <w:rPr>
           <w:rFonts w:cs="Times New Roman"/>
         </w:rPr>
-        <w:lastRenderedPageBreak/>
         <w:t>Data flow diagram.</w:t>
       </w:r>
     </w:p>
@@ -23432,6 +23527,7 @@
         <w:rPr>
           <w:rFonts w:cs="Times New Roman"/>
         </w:rPr>
+        <w:lastRenderedPageBreak/>
         <w:t>Use case diagram.</w:t>
       </w:r>
     </w:p>
@@ -23667,7 +23763,13 @@
         <w:rPr>
           <w:rFonts w:cs="Times New Roman"/>
         </w:rPr>
-        <w:t>Required backend environment variables:</w:t>
+        <w:t>B</w:t>
+      </w:r>
+      <w:r>
+        <w:rPr>
+          <w:rFonts w:cs="Times New Roman"/>
+        </w:rPr>
+        <w:t>ackend environment variables:</w:t>
       </w:r>
     </w:p>
     <w:p>
@@ -23719,20 +23821,20 @@
         <w:rPr>
           <w:rFonts w:cs="Times New Roman"/>
         </w:rPr>
+        <w:t>ADMIN_EMAIL=&lt;admin email&gt;</w:t>
+      </w:r>
+    </w:p>
+    <w:p>
+      <w:pPr>
+        <w:rPr>
+          <w:rFonts w:cs="Times New Roman"/>
+        </w:rPr>
+      </w:pPr>
+      <w:r>
+        <w:rPr>
+          <w:rFonts w:cs="Times New Roman"/>
+        </w:rPr>
         <w:lastRenderedPageBreak/>
-        <w:t>ADMIN_EMAIL=&lt;admin email&gt;</w:t>
-      </w:r>
-    </w:p>
-    <w:p>
-      <w:pPr>
-        <w:rPr>
-          <w:rFonts w:cs="Times New Roman"/>
-        </w:rPr>
-      </w:pPr>
-      <w:r>
-        <w:rPr>
-          <w:rFonts w:cs="Times New Roman"/>
-        </w:rPr>
         <w:t>ADMIN_PASSWORD=&lt;admin password&gt;</w:t>
       </w:r>
     </w:p>
@@ -23759,7 +23861,13 @@
         <w:rPr>
           <w:rFonts w:cs="Times New Roman"/>
         </w:rPr>
-        <w:t>Required frontend environment variable for physical devices:</w:t>
+        <w:t>F</w:t>
+      </w:r>
+      <w:r>
+        <w:rPr>
+          <w:rFonts w:cs="Times New Roman"/>
+        </w:rPr>
+        <w:t>rontend environment variable for physical devices:</w:t>
       </w:r>
     </w:p>
     <w:p>
@@ -23858,7 +23966,19 @@
               <w:rPr>
                 <w:rFonts w:cs="Times New Roman"/>
               </w:rPr>
-              <w:t>Where Covered</w:t>
+              <w:t>C</w:t>
+            </w:r>
+            <w:r>
+              <w:rPr>
+                <w:rFonts w:cs="Times New Roman"/>
+              </w:rPr>
+              <w:t>overed</w:t>
+            </w:r>
+            <w:r>
+              <w:rPr>
+                <w:rFonts w:cs="Times New Roman"/>
+              </w:rPr>
+              <w:t xml:space="preserve"> In</w:t>
             </w:r>
           </w:p>
         </w:tc>
@@ -24251,6 +24371,7 @@
         <w:docPartUnique/>
       </w:docPartObj>
     </w:sdtPr>
+    <w:sdtEndPr/>
     <w:sdtContent>
       <w:p>
         <w:pPr>
@@ -24271,7 +24392,7 @@
             <w:noProof/>
             <w:lang w:val="fr-FR"/>
           </w:rPr>
-          <w:t>x</w:t>
+          <w:t>vii</w:t>
         </w:r>
         <w:r>
           <w:fldChar w:fldCharType="end"/>
@@ -24297,6 +24418,7 @@
         <w:docPartUnique/>
       </w:docPartObj>
     </w:sdtPr>
+    <w:sdtEndPr/>
     <w:sdtContent>
       <w:p>
         <w:pPr>
@@ -31163,7 +31285,7 @@
 </file>
 
 <file path=customXml/itemProps1.xml><?xml version="1.0" encoding="utf-8"?>
-<ds:datastoreItem xmlns:ds="http://schemas.openxmlformats.org/officeDocument/2006/customXml" ds:itemID="{8FA1F3F0-358D-4C2C-83F1-C94C28427F16}">
+<ds:datastoreItem xmlns:ds="http://schemas.openxmlformats.org/officeDocument/2006/customXml" ds:itemID="{1BE9CBAE-BF8C-4649-86FC-5B6B1E41805C}">
   <ds:schemaRefs>
     <ds:schemaRef ds:uri="http://schemas.openxmlformats.org/officeDocument/2006/bibliography"/>
   </ds:schemaRefs>

</xml_diff>